<commit_message>
Update TAM participant responses
</commit_message>
<xml_diff>
--- a/after_data/P10/P01_2.2_TAM_Participant.docx
+++ b/after_data/P10/P01_2.2_TAM_Participant.docx
@@ -1,10 +1,10 @@
 
 <file path=word/document.xml><?xml version="1.0" encoding="utf-8"?>
-<w:document xmlns:wpc="http://schemas.microsoft.com/office/word/2010/wordprocessingCanvas" xmlns:cx="http://schemas.microsoft.com/office/drawing/2014/chartex" xmlns:cx1="http://schemas.microsoft.com/office/drawing/2015/9/8/chartex" xmlns:cx2="http://schemas.microsoft.com/office/drawing/2015/10/21/chartex" xmlns:cx3="http://schemas.microsoft.com/office/drawing/2016/5/9/chartex" xmlns:cx4="http://schemas.microsoft.com/office/drawing/2016/5/10/chartex" xmlns:cx5="http://schemas.microsoft.com/office/drawing/2016/5/11/chartex" xmlns:cx6="http://schemas.microsoft.com/office/drawing/2016/5/12/chartex" xmlns:cx7="http://schemas.microsoft.com/office/drawing/2016/5/13/chartex" xmlns:cx8="http://schemas.microsoft.com/office/drawing/2016/5/14/chartex" xmlns:mc="http://schemas.openxmlformats.org/markup-compatibility/2006" xmlns:m="http://schemas.openxmlformats.org/officeDocument/2006/math" xmlns:aink="http://schemas.microsoft.com/office/drawing/2016/ink" xmlns:am3d="http://schemas.microsoft.com/office/drawing/2017/model3d" xmlns:oel="http://schemas.microsoft.com/office/2019/extlst" xmlns:r="http://schemas.openxmlformats.org/officeDocument/2006/relationships" xmlns:wp14="http://schemas.microsoft.com/office/word/2010/wordprocessingDrawing" xmlns:wp="http://schemas.openxmlformats.org/drawingml/2006/wordprocessingDrawing" xmlns:wpg="http://schemas.microsoft.com/office/word/2010/wordprocessingGroup" xmlns:wpi="http://schemas.microsoft.com/office/word/2010/wordprocessingInk" xmlns:wps="http://schemas.microsoft.com/office/word/2010/wordprocessingShape" xmlns:o="urn:schemas-microsoft-com:office:office" xmlns:v="urn:schemas-microsoft-com:vml" xmlns:w10="urn:schemas-microsoft-com:office:word" xmlns:w="http://schemas.openxmlformats.org/wordprocessingml/2006/main" xmlns:w14="http://schemas.microsoft.com/office/word/2010/wordml" xmlns:w15="http://schemas.microsoft.com/office/word/2012/wordml" xmlns:w16cex="http://schemas.microsoft.com/office/word/2018/wordml/cex" xmlns:w16cid="http://schemas.microsoft.com/office/word/2016/wordml/cid" xmlns:w16="http://schemas.microsoft.com/office/word/2018/wordml" xmlns:w16sdtdh="http://schemas.microsoft.com/office/word/2020/wordml/sdtdatahash" xmlns:w16sdtfl="http://schemas.microsoft.com/office/word/2024/wordml/sdtformatlock" xmlns:w16se="http://schemas.microsoft.com/office/word/2015/wordml/symex" xmlns:w16du="http://schemas.microsoft.com/office/word/2023/wordml/word16du" xmlns:wne="http://schemas.microsoft.com/office/word/2006/wordml" mc:Ignorable="w14 w15 w16se w16cid w16 w16cex w16sdtdh w16sdtfl w16du wp14">
+<w:document xmlns:wpc="http://schemas.microsoft.com/office/word/2010/wordprocessingCanvas" xmlns:cx="http://schemas.microsoft.com/office/drawing/2014/chartex" xmlns:cx1="http://schemas.microsoft.com/office/drawing/2015/9/8/chartex" xmlns:cx2="http://schemas.microsoft.com/office/drawing/2015/10/21/chartex" xmlns:cx3="http://schemas.microsoft.com/office/drawing/2016/5/9/chartex" xmlns:cx4="http://schemas.microsoft.com/office/drawing/2016/5/10/chartex" xmlns:cx5="http://schemas.microsoft.com/office/drawing/2016/5/11/chartex" xmlns:cx6="http://schemas.microsoft.com/office/drawing/2016/5/12/chartex" xmlns:cx7="http://schemas.microsoft.com/office/drawing/2016/5/13/chartex" xmlns:cx8="http://schemas.microsoft.com/office/drawing/2016/5/14/chartex" xmlns:mc="http://schemas.openxmlformats.org/markup-compatibility/2006" xmlns:aink="http://schemas.microsoft.com/office/drawing/2016/ink" xmlns:am3d="http://schemas.microsoft.com/office/drawing/2017/model3d" xmlns:o="urn:schemas-microsoft-com:office:office" xmlns:oel="http://schemas.microsoft.com/office/2019/extlst" xmlns:r="http://schemas.openxmlformats.org/officeDocument/2006/relationships" xmlns:m="http://schemas.openxmlformats.org/officeDocument/2006/math" xmlns:v="urn:schemas-microsoft-com:vml" xmlns:wp14="http://schemas.microsoft.com/office/word/2010/wordprocessingDrawing" xmlns:wp="http://schemas.openxmlformats.org/drawingml/2006/wordprocessingDrawing" xmlns:w10="urn:schemas-microsoft-com:office:word" xmlns:w="http://schemas.openxmlformats.org/wordprocessingml/2006/main" xmlns:w14="http://schemas.microsoft.com/office/word/2010/wordml" xmlns:w15="http://schemas.microsoft.com/office/word/2012/wordml" xmlns:w16cex="http://schemas.microsoft.com/office/word/2018/wordml/cex" xmlns:w16cid="http://schemas.microsoft.com/office/word/2016/wordml/cid" xmlns:w16="http://schemas.microsoft.com/office/word/2018/wordml" xmlns:w16sdtdh="http://schemas.microsoft.com/office/word/2020/wordml/sdtdatahash" xmlns:w16se="http://schemas.microsoft.com/office/word/2015/wordml/symex" xmlns:wpg="http://schemas.microsoft.com/office/word/2010/wordprocessingGroup" xmlns:wpi="http://schemas.microsoft.com/office/word/2010/wordprocessingInk" xmlns:wne="http://schemas.microsoft.com/office/word/2006/wordml" xmlns:wps="http://schemas.microsoft.com/office/word/2010/wordprocessingShape" mc:Ignorable="w14 w15 w16se w16cid w16 w16cex w16sdtdh wp14">
   <w:body>
     <w:p>
       <w:pPr>
-        <w:pStyle w:val="Title"/>
+        <w:pStyle w:val="aa"/>
       </w:pPr>
       <w:r>
         <w:t>Layer 2.2 — Technology Acceptance Model (TAM) Participant Sheet</w:t>
@@ -23,7 +23,7 @@
     </w:p>
     <w:p>
       <w:pPr>
-        <w:pStyle w:val="Heading1"/>
+        <w:pStyle w:val="1"/>
       </w:pPr>
       <w:r>
         <w:t>Participant details</w:t>
@@ -31,7 +31,7 @@
     </w:p>
     <w:tbl>
       <w:tblPr>
-        <w:tblStyle w:val="TableGrid"/>
+        <w:tblStyle w:val="aff1"/>
         <w:tblW w:w="0" w:type="auto"/>
         <w:jc w:val="center"/>
         <w:tblLook w:val="04A0" w:firstRow="1" w:lastRow="0" w:firstColumn="1" w:lastColumn="0" w:noHBand="0" w:noVBand="1"/>
@@ -218,7 +218,7 @@
     </w:tbl>
     <w:p>
       <w:pPr>
-        <w:pStyle w:val="Heading1"/>
+        <w:pStyle w:val="1"/>
       </w:pPr>
       <w:r>
         <w:t>Participant instructions</w:t>
@@ -242,7 +242,7 @@
     </w:p>
     <w:p>
       <w:pPr>
-        <w:pStyle w:val="Heading1"/>
+        <w:pStyle w:val="1"/>
       </w:pPr>
       <w:r>
         <w:t>TAM questionnaire</w:t>
@@ -250,7 +250,7 @@
     </w:p>
     <w:tbl>
       <w:tblPr>
-        <w:tblStyle w:val="TableGrid"/>
+        <w:tblStyle w:val="aff1"/>
         <w:tblW w:w="0" w:type="auto"/>
         <w:jc w:val="center"/>
         <w:tblLook w:val="04A0" w:firstRow="1" w:lastRow="0" w:firstColumn="1" w:lastColumn="0" w:noHBand="0" w:noVBand="1"/>
@@ -382,7 +382,7 @@
                   <w:enabled/>
                   <w:calcOnExit w:val="0"/>
                   <w:ddList>
-                    <w:result w:val="0"/>
+                    <w:result w:val="5"/>
                     <w:listEntry w:val="— Select —"/>
                     <w:listEntry w:val="1"/>
                     <w:listEntry w:val="2"/>
@@ -480,7 +480,7 @@
                   <w:enabled/>
                   <w:calcOnExit w:val="0"/>
                   <w:ddList>
-                    <w:result w:val="0"/>
+                    <w:result w:val="5"/>
                     <w:listEntry w:val="— Select —"/>
                     <w:listEntry w:val="1"/>
                     <w:listEntry w:val="2"/>
@@ -576,7 +576,7 @@
                   <w:enabled/>
                   <w:calcOnExit w:val="0"/>
                   <w:ddList>
-                    <w:result w:val="0"/>
+                    <w:result w:val="5"/>
                     <w:listEntry w:val="— Select —"/>
                     <w:listEntry w:val="1"/>
                     <w:listEntry w:val="2"/>
@@ -672,7 +672,7 @@
                   <w:enabled/>
                   <w:calcOnExit w:val="0"/>
                   <w:ddList>
-                    <w:result w:val="0"/>
+                    <w:result w:val="4"/>
                     <w:listEntry w:val="— Select —"/>
                     <w:listEntry w:val="1"/>
                     <w:listEntry w:val="2"/>
@@ -768,7 +768,7 @@
                   <w:enabled/>
                   <w:calcOnExit w:val="0"/>
                   <w:ddList>
-                    <w:result w:val="0"/>
+                    <w:result w:val="4"/>
                     <w:listEntry w:val="— Select —"/>
                     <w:listEntry w:val="1"/>
                     <w:listEntry w:val="2"/>
@@ -864,7 +864,7 @@
                   <w:enabled/>
                   <w:calcOnExit w:val="0"/>
                   <w:ddList>
-                    <w:result w:val="0"/>
+                    <w:result w:val="5"/>
                     <w:listEntry w:val="— Select —"/>
                     <w:listEntry w:val="1"/>
                     <w:listEntry w:val="2"/>
@@ -960,7 +960,7 @@
                   <w:enabled/>
                   <w:calcOnExit w:val="0"/>
                   <w:ddList>
-                    <w:result w:val="0"/>
+                    <w:result w:val="5"/>
                     <w:listEntry w:val="— Select —"/>
                     <w:listEntry w:val="1"/>
                     <w:listEntry w:val="2"/>
@@ -1056,7 +1056,7 @@
                   <w:enabled/>
                   <w:calcOnExit w:val="0"/>
                   <w:ddList>
-                    <w:result w:val="0"/>
+                    <w:result w:val="5"/>
                     <w:listEntry w:val="— Select —"/>
                     <w:listEntry w:val="1"/>
                     <w:listEntry w:val="2"/>
@@ -1097,7 +1097,7 @@
     <w:p/>
     <w:p>
       <w:pPr>
-        <w:pStyle w:val="Heading1"/>
+        <w:pStyle w:val="1"/>
       </w:pPr>
       <w:r>
         <w:t>Supplementary decision-confidence item</w:t>
@@ -1113,7 +1113,7 @@
     </w:p>
     <w:tbl>
       <w:tblPr>
-        <w:tblStyle w:val="TableGrid"/>
+        <w:tblStyle w:val="aff1"/>
         <w:tblW w:w="0" w:type="auto"/>
         <w:tblLook w:val="04A0" w:firstRow="1" w:lastRow="0" w:firstColumn="1" w:lastColumn="0" w:noHBand="0" w:noVBand="1"/>
       </w:tblPr>
@@ -1155,7 +1155,7 @@
                   <w:enabled/>
                   <w:calcOnExit w:val="0"/>
                   <w:ddList>
-                    <w:result w:val="0"/>
+                    <w:result w:val="4"/>
                     <w:listEntry w:val="— Select —"/>
                     <w:listEntry w:val="1"/>
                     <w:listEntry w:val="2"/>
@@ -1200,7 +1200,7 @@
     </w:p>
     <w:p>
       <w:pPr>
-        <w:pStyle w:val="Heading1"/>
+        <w:pStyle w:val="1"/>
       </w:pPr>
       <w:r>
         <w:lastRenderedPageBreak/>
@@ -1209,7 +1209,7 @@
     </w:p>
     <w:p>
       <w:pPr>
-        <w:pStyle w:val="ListBullet"/>
+        <w:pStyle w:val="a0"/>
       </w:pPr>
       <w:r>
         <w:t>Perceived Usefulness (PU): not calculable — direct TAM ratings were not recorded.</w:t>
@@ -1217,7 +1217,7 @@
     </w:p>
     <w:p>
       <w:pPr>
-        <w:pStyle w:val="ListBullet"/>
+        <w:pStyle w:val="a0"/>
       </w:pPr>
       <w:r>
         <w:t>Perceived Ease of Use (PEOU): not calculable — direct TAM ratings were not recorded.</w:t>
@@ -1225,7 +1225,7 @@
     </w:p>
     <w:p>
       <w:pPr>
-        <w:pStyle w:val="ListBullet"/>
+        <w:pStyle w:val="a0"/>
       </w:pPr>
       <w:r>
         <w:t>Do not infer TAM scores from interview, observation, think-aloud, or separate quick-evaluation records.</w:t>
@@ -1233,7 +1233,7 @@
     </w:p>
     <w:p>
       <w:pPr>
-        <w:pStyle w:val="ListBullet"/>
+        <w:pStyle w:val="a0"/>
       </w:pPr>
       <w:r>
         <w:t>The supplementary confidence item was also not collected as a TAM response.</w:t>
@@ -1241,7 +1241,7 @@
     </w:p>
     <w:p>
       <w:pPr>
-        <w:pStyle w:val="ListBullet"/>
+        <w:pStyle w:val="a0"/>
       </w:pPr>
       <w:r>
         <w:t>For a small formative sample, report participant-level scores, group means, ranges, and recurring comments descriptively rather than making strong population-level claims.</w:t>
@@ -1269,7 +1269,7 @@
 </file>
 
 <file path=word/numbering.xml><?xml version="1.0" encoding="utf-8"?>
-<w:numbering xmlns:wpc="http://schemas.microsoft.com/office/word/2010/wordprocessingCanvas" xmlns:cx="http://schemas.microsoft.com/office/drawing/2014/chartex" xmlns:cx1="http://schemas.microsoft.com/office/drawing/2015/9/8/chartex" xmlns:cx2="http://schemas.microsoft.com/office/drawing/2015/10/21/chartex" xmlns:cx3="http://schemas.microsoft.com/office/drawing/2016/5/9/chartex" xmlns:cx4="http://schemas.microsoft.com/office/drawing/2016/5/10/chartex" xmlns:cx5="http://schemas.microsoft.com/office/drawing/2016/5/11/chartex" xmlns:cx6="http://schemas.microsoft.com/office/drawing/2016/5/12/chartex" xmlns:cx7="http://schemas.microsoft.com/office/drawing/2016/5/13/chartex" xmlns:cx8="http://schemas.microsoft.com/office/drawing/2016/5/14/chartex" xmlns:mc="http://schemas.openxmlformats.org/markup-compatibility/2006" xmlns:m="http://schemas.openxmlformats.org/officeDocument/2006/math" xmlns:aink="http://schemas.microsoft.com/office/drawing/2016/ink" xmlns:am3d="http://schemas.microsoft.com/office/drawing/2017/model3d" xmlns:oel="http://schemas.microsoft.com/office/2019/extlst" xmlns:r="http://schemas.openxmlformats.org/officeDocument/2006/relationships" xmlns:wp14="http://schemas.microsoft.com/office/word/2010/wordprocessingDrawing" xmlns:wp="http://schemas.openxmlformats.org/drawingml/2006/wordprocessingDrawing" xmlns:wpg="http://schemas.microsoft.com/office/word/2010/wordprocessingGroup" xmlns:wpi="http://schemas.microsoft.com/office/word/2010/wordprocessingInk" xmlns:wps="http://schemas.microsoft.com/office/word/2010/wordprocessingShape" xmlns:o="urn:schemas-microsoft-com:office:office" xmlns:v="urn:schemas-microsoft-com:vml" xmlns:w10="urn:schemas-microsoft-com:office:word" xmlns:w="http://schemas.openxmlformats.org/wordprocessingml/2006/main" xmlns:w14="http://schemas.microsoft.com/office/word/2010/wordml" xmlns:w15="http://schemas.microsoft.com/office/word/2012/wordml" xmlns:w16cex="http://schemas.microsoft.com/office/word/2018/wordml/cex" xmlns:w16cid="http://schemas.microsoft.com/office/word/2016/wordml/cid" xmlns:w16="http://schemas.microsoft.com/office/word/2018/wordml" xmlns:w16sdtdh="http://schemas.microsoft.com/office/word/2020/wordml/sdtdatahash" xmlns:w16sdtfl="http://schemas.microsoft.com/office/word/2024/wordml/sdtformatlock" xmlns:w16se="http://schemas.microsoft.com/office/word/2015/wordml/symex" xmlns:w16du="http://schemas.microsoft.com/office/word/2023/wordml/word16du" xmlns:wne="http://schemas.microsoft.com/office/word/2006/wordml" mc:Ignorable="w14 w15 w16se w16cid w16 w16cex w16sdtdh w16sdtfl w16du wp14">
+<w:numbering xmlns:wpc="http://schemas.microsoft.com/office/word/2010/wordprocessingCanvas" xmlns:cx="http://schemas.microsoft.com/office/drawing/2014/chartex" xmlns:cx1="http://schemas.microsoft.com/office/drawing/2015/9/8/chartex" xmlns:cx2="http://schemas.microsoft.com/office/drawing/2015/10/21/chartex" xmlns:cx3="http://schemas.microsoft.com/office/drawing/2016/5/9/chartex" xmlns:cx4="http://schemas.microsoft.com/office/drawing/2016/5/10/chartex" xmlns:cx5="http://schemas.microsoft.com/office/drawing/2016/5/11/chartex" xmlns:cx6="http://schemas.microsoft.com/office/drawing/2016/5/12/chartex" xmlns:cx7="http://schemas.microsoft.com/office/drawing/2016/5/13/chartex" xmlns:cx8="http://schemas.microsoft.com/office/drawing/2016/5/14/chartex" xmlns:mc="http://schemas.openxmlformats.org/markup-compatibility/2006" xmlns:aink="http://schemas.microsoft.com/office/drawing/2016/ink" xmlns:am3d="http://schemas.microsoft.com/office/drawing/2017/model3d" xmlns:o="urn:schemas-microsoft-com:office:office" xmlns:oel="http://schemas.microsoft.com/office/2019/extlst" xmlns:r="http://schemas.openxmlformats.org/officeDocument/2006/relationships" xmlns:m="http://schemas.openxmlformats.org/officeDocument/2006/math" xmlns:v="urn:schemas-microsoft-com:vml" xmlns:wp14="http://schemas.microsoft.com/office/word/2010/wordprocessingDrawing" xmlns:wp="http://schemas.openxmlformats.org/drawingml/2006/wordprocessingDrawing" xmlns:w10="urn:schemas-microsoft-com:office:word" xmlns:w="http://schemas.openxmlformats.org/wordprocessingml/2006/main" xmlns:w14="http://schemas.microsoft.com/office/word/2010/wordml" xmlns:w15="http://schemas.microsoft.com/office/word/2012/wordml" xmlns:w16cex="http://schemas.microsoft.com/office/word/2018/wordml/cex" xmlns:w16cid="http://schemas.microsoft.com/office/word/2016/wordml/cid" xmlns:w16="http://schemas.microsoft.com/office/word/2018/wordml" xmlns:w16sdtdh="http://schemas.microsoft.com/office/word/2020/wordml/sdtdatahash" xmlns:w16se="http://schemas.microsoft.com/office/word/2015/wordml/symex" xmlns:wpg="http://schemas.microsoft.com/office/word/2010/wordprocessingGroup" xmlns:wpi="http://schemas.microsoft.com/office/word/2010/wordprocessingInk" xmlns:wne="http://schemas.microsoft.com/office/word/2006/wordml" xmlns:wps="http://schemas.microsoft.com/office/word/2010/wordprocessingShape" mc:Ignorable="w14 w15 w16se w16cid w16 w16cex w16sdtdh wp14">
   <w:abstractNum w:abstractNumId="0" w15:restartNumberingAfterBreak="0">
     <w:nsid w:val="FFFFFF7C"/>
     <w:multiLevelType w:val="singleLevel"/>
@@ -1311,7 +1311,7 @@
     <w:lvl w:ilvl="0">
       <w:start w:val="1"/>
       <w:numFmt w:val="decimal"/>
-      <w:pStyle w:val="ListNumber3"/>
+      <w:pStyle w:val="3"/>
       <w:lvlText w:val="%1."/>
       <w:lvlJc w:val="left"/>
       <w:pPr>
@@ -1329,7 +1329,7 @@
     <w:lvl w:ilvl="0">
       <w:start w:val="1"/>
       <w:numFmt w:val="decimal"/>
-      <w:pStyle w:val="ListNumber2"/>
+      <w:pStyle w:val="2"/>
       <w:lvlText w:val="%1."/>
       <w:lvlJc w:val="left"/>
       <w:pPr>
@@ -1367,7 +1367,7 @@
     <w:lvl w:ilvl="0">
       <w:start w:val="1"/>
       <w:numFmt w:val="bullet"/>
-      <w:pStyle w:val="ListBullet3"/>
+      <w:pStyle w:val="30"/>
       <w:lvlText w:val=""/>
       <w:lvlJc w:val="left"/>
       <w:pPr>
@@ -1388,7 +1388,7 @@
     <w:lvl w:ilvl="0">
       <w:start w:val="1"/>
       <w:numFmt w:val="bullet"/>
-      <w:pStyle w:val="ListBullet2"/>
+      <w:pStyle w:val="20"/>
       <w:lvlText w:val=""/>
       <w:lvlJc w:val="left"/>
       <w:pPr>
@@ -1409,7 +1409,7 @@
     <w:lvl w:ilvl="0">
       <w:start w:val="1"/>
       <w:numFmt w:val="decimal"/>
-      <w:pStyle w:val="ListNumber"/>
+      <w:pStyle w:val="a"/>
       <w:lvlText w:val="%1."/>
       <w:lvlJc w:val="left"/>
       <w:pPr>
@@ -1427,7 +1427,7 @@
     <w:lvl w:ilvl="0">
       <w:start w:val="1"/>
       <w:numFmt w:val="bullet"/>
-      <w:pStyle w:val="ListBullet"/>
+      <w:pStyle w:val="a0"/>
       <w:lvlText w:val=""/>
       <w:lvlJc w:val="left"/>
       <w:pPr>
@@ -1472,7 +1472,7 @@
 </file>
 
 <file path=word/styles.xml><?xml version="1.0" encoding="utf-8"?>
-<w:styles xmlns:mc="http://schemas.openxmlformats.org/markup-compatibility/2006" xmlns:r="http://schemas.openxmlformats.org/officeDocument/2006/relationships" xmlns:w="http://schemas.openxmlformats.org/wordprocessingml/2006/main" xmlns:w14="http://schemas.microsoft.com/office/word/2010/wordml" xmlns:w15="http://schemas.microsoft.com/office/word/2012/wordml" xmlns:w16cex="http://schemas.microsoft.com/office/word/2018/wordml/cex" xmlns:w16cid="http://schemas.microsoft.com/office/word/2016/wordml/cid" xmlns:w16="http://schemas.microsoft.com/office/word/2018/wordml" xmlns:w16sdtdh="http://schemas.microsoft.com/office/word/2020/wordml/sdtdatahash" xmlns:w16sdtfl="http://schemas.microsoft.com/office/word/2024/wordml/sdtformatlock" xmlns:w16se="http://schemas.microsoft.com/office/word/2015/wordml/symex" xmlns:w16du="http://schemas.microsoft.com/office/word/2023/wordml/word16du" mc:Ignorable="w14 w15 w16se w16cid w16 w16cex w16sdtdh w16sdtfl w16du">
+<w:styles xmlns:mc="http://schemas.openxmlformats.org/markup-compatibility/2006" xmlns:r="http://schemas.openxmlformats.org/officeDocument/2006/relationships" xmlns:w="http://schemas.openxmlformats.org/wordprocessingml/2006/main" xmlns:w14="http://schemas.microsoft.com/office/word/2010/wordml" xmlns:w15="http://schemas.microsoft.com/office/word/2012/wordml" xmlns:w16cex="http://schemas.microsoft.com/office/word/2018/wordml/cex" xmlns:w16cid="http://schemas.microsoft.com/office/word/2016/wordml/cid" xmlns:w16="http://schemas.microsoft.com/office/word/2018/wordml" xmlns:w16sdtdh="http://schemas.microsoft.com/office/word/2020/wordml/sdtdatahash" xmlns:w16se="http://schemas.microsoft.com/office/word/2015/wordml/symex" mc:Ignorable="w14 w15 w16se w16cid w16 w16cex w16sdtdh">
   <w:docDefaults>
     <w:rPrDefault>
       <w:rPr>
@@ -1857,7 +1857,7 @@
     <w:lsdException w:name="Unresolved Mention" w:semiHidden="1" w:unhideWhenUsed="1"/>
     <w:lsdException w:name="Smart Link" w:semiHidden="1" w:unhideWhenUsed="1"/>
   </w:latentStyles>
-  <w:style w:type="paragraph" w:default="1" w:styleId="Normal">
+  <w:style w:type="paragraph" w:default="1" w:styleId="a1">
     <w:name w:val="Normal"/>
     <w:qFormat/>
     <w:rsid w:val="00FC693F"/>
@@ -1866,11 +1866,11 @@
       <w:sz w:val="21"/>
     </w:rPr>
   </w:style>
-  <w:style w:type="paragraph" w:styleId="Heading1">
+  <w:style w:type="paragraph" w:styleId="1">
     <w:name w:val="heading 1"/>
-    <w:basedOn w:val="Normal"/>
-    <w:next w:val="Normal"/>
-    <w:link w:val="Heading1Char"/>
+    <w:basedOn w:val="a1"/>
+    <w:next w:val="a1"/>
+    <w:link w:val="10"/>
     <w:uiPriority w:val="9"/>
     <w:qFormat/>
     <w:rsid w:val="00FC693F"/>
@@ -1889,11 +1889,11 @@
       <w:szCs w:val="28"/>
     </w:rPr>
   </w:style>
-  <w:style w:type="paragraph" w:styleId="Heading2">
+  <w:style w:type="paragraph" w:styleId="21">
     <w:name w:val="heading 2"/>
-    <w:basedOn w:val="Normal"/>
-    <w:next w:val="Normal"/>
-    <w:link w:val="Heading2Char"/>
+    <w:basedOn w:val="a1"/>
+    <w:next w:val="a1"/>
+    <w:link w:val="22"/>
     <w:uiPriority w:val="9"/>
     <w:unhideWhenUsed/>
     <w:qFormat/>
@@ -1913,11 +1913,11 @@
       <w:szCs w:val="26"/>
     </w:rPr>
   </w:style>
-  <w:style w:type="paragraph" w:styleId="Heading3">
+  <w:style w:type="paragraph" w:styleId="31">
     <w:name w:val="heading 3"/>
-    <w:basedOn w:val="Normal"/>
-    <w:next w:val="Normal"/>
-    <w:link w:val="Heading3Char"/>
+    <w:basedOn w:val="a1"/>
+    <w:next w:val="a1"/>
+    <w:link w:val="32"/>
     <w:uiPriority w:val="9"/>
     <w:unhideWhenUsed/>
     <w:qFormat/>
@@ -1935,11 +1935,11 @@
       <w:color w:val="4F81BD" w:themeColor="accent1"/>
     </w:rPr>
   </w:style>
-  <w:style w:type="paragraph" w:styleId="Heading4">
+  <w:style w:type="paragraph" w:styleId="4">
     <w:name w:val="heading 4"/>
-    <w:basedOn w:val="Normal"/>
-    <w:next w:val="Normal"/>
-    <w:link w:val="Heading4Char"/>
+    <w:basedOn w:val="a1"/>
+    <w:next w:val="a1"/>
+    <w:link w:val="40"/>
     <w:uiPriority w:val="9"/>
     <w:semiHidden/>
     <w:unhideWhenUsed/>
@@ -1960,11 +1960,11 @@
       <w:color w:val="4F81BD" w:themeColor="accent1"/>
     </w:rPr>
   </w:style>
-  <w:style w:type="paragraph" w:styleId="Heading5">
+  <w:style w:type="paragraph" w:styleId="5">
     <w:name w:val="heading 5"/>
-    <w:basedOn w:val="Normal"/>
-    <w:next w:val="Normal"/>
-    <w:link w:val="Heading5Char"/>
+    <w:basedOn w:val="a1"/>
+    <w:next w:val="a1"/>
+    <w:link w:val="50"/>
     <w:uiPriority w:val="9"/>
     <w:semiHidden/>
     <w:unhideWhenUsed/>
@@ -1981,11 +1981,11 @@
       <w:color w:val="243F60" w:themeColor="accent1" w:themeShade="7F"/>
     </w:rPr>
   </w:style>
-  <w:style w:type="paragraph" w:styleId="Heading6">
+  <w:style w:type="paragraph" w:styleId="6">
     <w:name w:val="heading 6"/>
-    <w:basedOn w:val="Normal"/>
-    <w:next w:val="Normal"/>
-    <w:link w:val="Heading6Char"/>
+    <w:basedOn w:val="a1"/>
+    <w:next w:val="a1"/>
+    <w:link w:val="60"/>
     <w:uiPriority w:val="9"/>
     <w:semiHidden/>
     <w:unhideWhenUsed/>
@@ -2004,11 +2004,11 @@
       <w:color w:val="243F60" w:themeColor="accent1" w:themeShade="7F"/>
     </w:rPr>
   </w:style>
-  <w:style w:type="paragraph" w:styleId="Heading7">
+  <w:style w:type="paragraph" w:styleId="7">
     <w:name w:val="heading 7"/>
-    <w:basedOn w:val="Normal"/>
-    <w:next w:val="Normal"/>
-    <w:link w:val="Heading7Char"/>
+    <w:basedOn w:val="a1"/>
+    <w:next w:val="a1"/>
+    <w:link w:val="70"/>
     <w:uiPriority w:val="9"/>
     <w:semiHidden/>
     <w:unhideWhenUsed/>
@@ -2027,11 +2027,11 @@
       <w:color w:val="404040" w:themeColor="text1" w:themeTint="BF"/>
     </w:rPr>
   </w:style>
-  <w:style w:type="paragraph" w:styleId="Heading8">
+  <w:style w:type="paragraph" w:styleId="8">
     <w:name w:val="heading 8"/>
-    <w:basedOn w:val="Normal"/>
-    <w:next w:val="Normal"/>
-    <w:link w:val="Heading8Char"/>
+    <w:basedOn w:val="a1"/>
+    <w:next w:val="a1"/>
+    <w:link w:val="80"/>
     <w:uiPriority w:val="9"/>
     <w:semiHidden/>
     <w:unhideWhenUsed/>
@@ -2050,11 +2050,11 @@
       <w:szCs w:val="20"/>
     </w:rPr>
   </w:style>
-  <w:style w:type="paragraph" w:styleId="Heading9">
+  <w:style w:type="paragraph" w:styleId="9">
     <w:name w:val="heading 9"/>
-    <w:basedOn w:val="Normal"/>
-    <w:next w:val="Normal"/>
-    <w:link w:val="Heading9Char"/>
+    <w:basedOn w:val="a1"/>
+    <w:next w:val="a1"/>
+    <w:link w:val="90"/>
     <w:uiPriority w:val="9"/>
     <w:semiHidden/>
     <w:unhideWhenUsed/>
@@ -2075,13 +2075,13 @@
       <w:szCs w:val="20"/>
     </w:rPr>
   </w:style>
-  <w:style w:type="character" w:default="1" w:styleId="DefaultParagraphFont">
+  <w:style w:type="character" w:default="1" w:styleId="a2">
     <w:name w:val="Default Paragraph Font"/>
     <w:uiPriority w:val="1"/>
     <w:semiHidden/>
     <w:unhideWhenUsed/>
   </w:style>
-  <w:style w:type="table" w:default="1" w:styleId="TableNormal">
+  <w:style w:type="table" w:default="1" w:styleId="a3">
     <w:name w:val="Normal Table"/>
     <w:uiPriority w:val="99"/>
     <w:semiHidden/>
@@ -2096,16 +2096,16 @@
       </w:tblCellMar>
     </w:tblPr>
   </w:style>
-  <w:style w:type="numbering" w:default="1" w:styleId="NoList">
+  <w:style w:type="numbering" w:default="1" w:styleId="a4">
     <w:name w:val="No List"/>
     <w:uiPriority w:val="99"/>
     <w:semiHidden/>
     <w:unhideWhenUsed/>
   </w:style>
-  <w:style w:type="paragraph" w:styleId="Header">
+  <w:style w:type="paragraph" w:styleId="a5">
     <w:name w:val="header"/>
-    <w:basedOn w:val="Normal"/>
-    <w:link w:val="HeaderChar"/>
+    <w:basedOn w:val="a1"/>
+    <w:link w:val="a6"/>
     <w:uiPriority w:val="99"/>
     <w:unhideWhenUsed/>
     <w:rsid w:val="00E618BF"/>
@@ -2117,17 +2117,17 @@
       <w:spacing w:after="0" w:line="240" w:lineRule="auto"/>
     </w:pPr>
   </w:style>
-  <w:style w:type="character" w:customStyle="1" w:styleId="HeaderChar">
-    <w:name w:val="Header Char"/>
-    <w:basedOn w:val="DefaultParagraphFont"/>
-    <w:link w:val="Header"/>
+  <w:style w:type="character" w:customStyle="1" w:styleId="a6">
+    <w:name w:val="页眉 字符"/>
+    <w:basedOn w:val="a2"/>
+    <w:link w:val="a5"/>
     <w:uiPriority w:val="99"/>
     <w:rsid w:val="00E618BF"/>
   </w:style>
-  <w:style w:type="paragraph" w:styleId="Footer">
+  <w:style w:type="paragraph" w:styleId="a7">
     <w:name w:val="footer"/>
-    <w:basedOn w:val="Normal"/>
-    <w:link w:val="FooterChar"/>
+    <w:basedOn w:val="a1"/>
+    <w:link w:val="a8"/>
     <w:uiPriority w:val="99"/>
     <w:unhideWhenUsed/>
     <w:rsid w:val="00E618BF"/>
@@ -2139,14 +2139,14 @@
       <w:spacing w:after="0" w:line="240" w:lineRule="auto"/>
     </w:pPr>
   </w:style>
-  <w:style w:type="character" w:customStyle="1" w:styleId="FooterChar">
-    <w:name w:val="Footer Char"/>
-    <w:basedOn w:val="DefaultParagraphFont"/>
-    <w:link w:val="Footer"/>
+  <w:style w:type="character" w:customStyle="1" w:styleId="a8">
+    <w:name w:val="页脚 字符"/>
+    <w:basedOn w:val="a2"/>
+    <w:link w:val="a7"/>
     <w:uiPriority w:val="99"/>
     <w:rsid w:val="00E618BF"/>
   </w:style>
-  <w:style w:type="paragraph" w:styleId="NoSpacing">
+  <w:style w:type="paragraph" w:styleId="a9">
     <w:name w:val="No Spacing"/>
     <w:uiPriority w:val="1"/>
     <w:qFormat/>
@@ -2155,10 +2155,10 @@
       <w:spacing w:after="0" w:line="240" w:lineRule="auto"/>
     </w:pPr>
   </w:style>
-  <w:style w:type="character" w:customStyle="1" w:styleId="Heading1Char">
-    <w:name w:val="Heading 1 Char"/>
-    <w:basedOn w:val="DefaultParagraphFont"/>
-    <w:link w:val="Heading1"/>
+  <w:style w:type="character" w:customStyle="1" w:styleId="10">
+    <w:name w:val="标题 1 字符"/>
+    <w:basedOn w:val="a2"/>
+    <w:link w:val="1"/>
     <w:uiPriority w:val="9"/>
     <w:rsid w:val="00FC693F"/>
     <w:rPr>
@@ -2170,10 +2170,10 @@
       <w:szCs w:val="28"/>
     </w:rPr>
   </w:style>
-  <w:style w:type="character" w:customStyle="1" w:styleId="Heading2Char">
-    <w:name w:val="Heading 2 Char"/>
-    <w:basedOn w:val="DefaultParagraphFont"/>
-    <w:link w:val="Heading2"/>
+  <w:style w:type="character" w:customStyle="1" w:styleId="22">
+    <w:name w:val="标题 2 字符"/>
+    <w:basedOn w:val="a2"/>
+    <w:link w:val="21"/>
     <w:uiPriority w:val="9"/>
     <w:rsid w:val="00FC693F"/>
     <w:rPr>
@@ -2185,10 +2185,10 @@
       <w:szCs w:val="26"/>
     </w:rPr>
   </w:style>
-  <w:style w:type="character" w:customStyle="1" w:styleId="Heading3Char">
-    <w:name w:val="Heading 3 Char"/>
-    <w:basedOn w:val="DefaultParagraphFont"/>
-    <w:link w:val="Heading3"/>
+  <w:style w:type="character" w:customStyle="1" w:styleId="32">
+    <w:name w:val="标题 3 字符"/>
+    <w:basedOn w:val="a2"/>
+    <w:link w:val="31"/>
     <w:uiPriority w:val="9"/>
     <w:rsid w:val="00FC693F"/>
     <w:rPr>
@@ -2198,11 +2198,11 @@
       <w:color w:val="4F81BD" w:themeColor="accent1"/>
     </w:rPr>
   </w:style>
-  <w:style w:type="paragraph" w:styleId="Title">
+  <w:style w:type="paragraph" w:styleId="aa">
     <w:name w:val="Title"/>
-    <w:basedOn w:val="Normal"/>
-    <w:next w:val="Normal"/>
-    <w:link w:val="TitleChar"/>
+    <w:basedOn w:val="a1"/>
+    <w:next w:val="a1"/>
+    <w:link w:val="ab"/>
     <w:uiPriority w:val="10"/>
     <w:qFormat/>
     <w:rsid w:val="00FC693F"/>
@@ -2223,10 +2223,10 @@
       <w:szCs w:val="52"/>
     </w:rPr>
   </w:style>
-  <w:style w:type="character" w:customStyle="1" w:styleId="TitleChar">
-    <w:name w:val="Title Char"/>
-    <w:basedOn w:val="DefaultParagraphFont"/>
-    <w:link w:val="Title"/>
+  <w:style w:type="character" w:customStyle="1" w:styleId="ab">
+    <w:name w:val="标题 字符"/>
+    <w:basedOn w:val="a2"/>
+    <w:link w:val="aa"/>
     <w:uiPriority w:val="10"/>
     <w:rsid w:val="00FC693F"/>
     <w:rPr>
@@ -2238,11 +2238,11 @@
       <w:szCs w:val="52"/>
     </w:rPr>
   </w:style>
-  <w:style w:type="paragraph" w:styleId="Subtitle">
+  <w:style w:type="paragraph" w:styleId="ac">
     <w:name w:val="Subtitle"/>
-    <w:basedOn w:val="Normal"/>
-    <w:next w:val="Normal"/>
-    <w:link w:val="SubtitleChar"/>
+    <w:basedOn w:val="a1"/>
+    <w:next w:val="a1"/>
+    <w:link w:val="ad"/>
     <w:uiPriority w:val="11"/>
     <w:qFormat/>
     <w:rsid w:val="00FC693F"/>
@@ -2261,10 +2261,10 @@
       <w:szCs w:val="24"/>
     </w:rPr>
   </w:style>
-  <w:style w:type="character" w:customStyle="1" w:styleId="SubtitleChar">
-    <w:name w:val="Subtitle Char"/>
-    <w:basedOn w:val="DefaultParagraphFont"/>
-    <w:link w:val="Subtitle"/>
+  <w:style w:type="character" w:customStyle="1" w:styleId="ad">
+    <w:name w:val="副标题 字符"/>
+    <w:basedOn w:val="a2"/>
+    <w:link w:val="ac"/>
     <w:uiPriority w:val="11"/>
     <w:rsid w:val="00FC693F"/>
     <w:rPr>
@@ -2277,9 +2277,9 @@
       <w:szCs w:val="24"/>
     </w:rPr>
   </w:style>
-  <w:style w:type="paragraph" w:styleId="ListParagraph">
+  <w:style w:type="paragraph" w:styleId="ae">
     <w:name w:val="List Paragraph"/>
-    <w:basedOn w:val="Normal"/>
+    <w:basedOn w:val="a1"/>
     <w:uiPriority w:val="34"/>
     <w:qFormat/>
     <w:rsid w:val="00FC693F"/>
@@ -2288,10 +2288,10 @@
       <w:contextualSpacing/>
     </w:pPr>
   </w:style>
-  <w:style w:type="paragraph" w:styleId="BodyText">
+  <w:style w:type="paragraph" w:styleId="af">
     <w:name w:val="Body Text"/>
-    <w:basedOn w:val="Normal"/>
-    <w:link w:val="BodyTextChar"/>
+    <w:basedOn w:val="a1"/>
+    <w:link w:val="af0"/>
     <w:uiPriority w:val="99"/>
     <w:unhideWhenUsed/>
     <w:rsid w:val="00AA1D8D"/>
@@ -2299,17 +2299,17 @@
       <w:spacing w:after="120"/>
     </w:pPr>
   </w:style>
-  <w:style w:type="character" w:customStyle="1" w:styleId="BodyTextChar">
-    <w:name w:val="Body Text Char"/>
-    <w:basedOn w:val="DefaultParagraphFont"/>
-    <w:link w:val="BodyText"/>
+  <w:style w:type="character" w:customStyle="1" w:styleId="af0">
+    <w:name w:val="正文文本 字符"/>
+    <w:basedOn w:val="a2"/>
+    <w:link w:val="af"/>
     <w:uiPriority w:val="99"/>
     <w:rsid w:val="00AA1D8D"/>
   </w:style>
-  <w:style w:type="paragraph" w:styleId="BodyText2">
+  <w:style w:type="paragraph" w:styleId="23">
     <w:name w:val="Body Text 2"/>
-    <w:basedOn w:val="Normal"/>
-    <w:link w:val="BodyText2Char"/>
+    <w:basedOn w:val="a1"/>
+    <w:link w:val="24"/>
     <w:uiPriority w:val="99"/>
     <w:unhideWhenUsed/>
     <w:rsid w:val="00AA1D8D"/>
@@ -2317,17 +2317,17 @@
       <w:spacing w:after="120" w:line="480" w:lineRule="auto"/>
     </w:pPr>
   </w:style>
-  <w:style w:type="character" w:customStyle="1" w:styleId="BodyText2Char">
-    <w:name w:val="Body Text 2 Char"/>
-    <w:basedOn w:val="DefaultParagraphFont"/>
-    <w:link w:val="BodyText2"/>
+  <w:style w:type="character" w:customStyle="1" w:styleId="24">
+    <w:name w:val="正文文本 2 字符"/>
+    <w:basedOn w:val="a2"/>
+    <w:link w:val="23"/>
     <w:uiPriority w:val="99"/>
     <w:rsid w:val="00AA1D8D"/>
   </w:style>
-  <w:style w:type="paragraph" w:styleId="BodyText3">
+  <w:style w:type="paragraph" w:styleId="33">
     <w:name w:val="Body Text 3"/>
-    <w:basedOn w:val="Normal"/>
-    <w:link w:val="BodyText3Char"/>
+    <w:basedOn w:val="a1"/>
+    <w:link w:val="34"/>
     <w:uiPriority w:val="99"/>
     <w:unhideWhenUsed/>
     <w:rsid w:val="00AA1D8D"/>
@@ -2339,10 +2339,10 @@
       <w:szCs w:val="16"/>
     </w:rPr>
   </w:style>
-  <w:style w:type="character" w:customStyle="1" w:styleId="BodyText3Char">
-    <w:name w:val="Body Text 3 Char"/>
-    <w:basedOn w:val="DefaultParagraphFont"/>
-    <w:link w:val="BodyText3"/>
+  <w:style w:type="character" w:customStyle="1" w:styleId="34">
+    <w:name w:val="正文文本 3 字符"/>
+    <w:basedOn w:val="a2"/>
+    <w:link w:val="33"/>
     <w:uiPriority w:val="99"/>
     <w:rsid w:val="00AA1D8D"/>
     <w:rPr>
@@ -2350,9 +2350,9 @@
       <w:szCs w:val="16"/>
     </w:rPr>
   </w:style>
-  <w:style w:type="paragraph" w:styleId="List">
+  <w:style w:type="paragraph" w:styleId="af1">
     <w:name w:val="List"/>
-    <w:basedOn w:val="Normal"/>
+    <w:basedOn w:val="a1"/>
     <w:uiPriority w:val="99"/>
     <w:unhideWhenUsed/>
     <w:rsid w:val="00AA1D8D"/>
@@ -2361,9 +2361,9 @@
       <w:contextualSpacing/>
     </w:pPr>
   </w:style>
-  <w:style w:type="paragraph" w:styleId="List2">
+  <w:style w:type="paragraph" w:styleId="25">
     <w:name w:val="List 2"/>
-    <w:basedOn w:val="Normal"/>
+    <w:basedOn w:val="a1"/>
     <w:uiPriority w:val="99"/>
     <w:unhideWhenUsed/>
     <w:rsid w:val="00326F90"/>
@@ -2372,9 +2372,9 @@
       <w:contextualSpacing/>
     </w:pPr>
   </w:style>
-  <w:style w:type="paragraph" w:styleId="List3">
+  <w:style w:type="paragraph" w:styleId="35">
     <w:name w:val="List 3"/>
-    <w:basedOn w:val="Normal"/>
+    <w:basedOn w:val="a1"/>
     <w:uiPriority w:val="99"/>
     <w:unhideWhenUsed/>
     <w:rsid w:val="00326F90"/>
@@ -2383,9 +2383,9 @@
       <w:contextualSpacing/>
     </w:pPr>
   </w:style>
-  <w:style w:type="paragraph" w:styleId="ListBullet">
+  <w:style w:type="paragraph" w:styleId="a0">
     <w:name w:val="List Bullet"/>
-    <w:basedOn w:val="Normal"/>
+    <w:basedOn w:val="a1"/>
     <w:uiPriority w:val="99"/>
     <w:unhideWhenUsed/>
     <w:rsid w:val="00326F90"/>
@@ -2396,9 +2396,9 @@
       <w:contextualSpacing/>
     </w:pPr>
   </w:style>
-  <w:style w:type="paragraph" w:styleId="ListBullet2">
+  <w:style w:type="paragraph" w:styleId="20">
     <w:name w:val="List Bullet 2"/>
-    <w:basedOn w:val="Normal"/>
+    <w:basedOn w:val="a1"/>
     <w:uiPriority w:val="99"/>
     <w:unhideWhenUsed/>
     <w:rsid w:val="00326F90"/>
@@ -2409,9 +2409,9 @@
       <w:contextualSpacing/>
     </w:pPr>
   </w:style>
-  <w:style w:type="paragraph" w:styleId="ListBullet3">
+  <w:style w:type="paragraph" w:styleId="30">
     <w:name w:val="List Bullet 3"/>
-    <w:basedOn w:val="Normal"/>
+    <w:basedOn w:val="a1"/>
     <w:uiPriority w:val="99"/>
     <w:unhideWhenUsed/>
     <w:rsid w:val="00326F90"/>
@@ -2422,9 +2422,9 @@
       <w:contextualSpacing/>
     </w:pPr>
   </w:style>
-  <w:style w:type="paragraph" w:styleId="ListNumber">
+  <w:style w:type="paragraph" w:styleId="a">
     <w:name w:val="List Number"/>
-    <w:basedOn w:val="Normal"/>
+    <w:basedOn w:val="a1"/>
     <w:uiPriority w:val="99"/>
     <w:unhideWhenUsed/>
     <w:rsid w:val="00326F90"/>
@@ -2435,9 +2435,9 @@
       <w:contextualSpacing/>
     </w:pPr>
   </w:style>
-  <w:style w:type="paragraph" w:styleId="ListNumber2">
+  <w:style w:type="paragraph" w:styleId="2">
     <w:name w:val="List Number 2"/>
-    <w:basedOn w:val="Normal"/>
+    <w:basedOn w:val="a1"/>
     <w:uiPriority w:val="99"/>
     <w:unhideWhenUsed/>
     <w:rsid w:val="0029639D"/>
@@ -2448,9 +2448,9 @@
       <w:contextualSpacing/>
     </w:pPr>
   </w:style>
-  <w:style w:type="paragraph" w:styleId="ListNumber3">
+  <w:style w:type="paragraph" w:styleId="3">
     <w:name w:val="List Number 3"/>
-    <w:basedOn w:val="Normal"/>
+    <w:basedOn w:val="a1"/>
     <w:uiPriority w:val="99"/>
     <w:unhideWhenUsed/>
     <w:rsid w:val="0029639D"/>
@@ -2461,9 +2461,9 @@
       <w:contextualSpacing/>
     </w:pPr>
   </w:style>
-  <w:style w:type="paragraph" w:styleId="ListContinue">
+  <w:style w:type="paragraph" w:styleId="af2">
     <w:name w:val="List Continue"/>
-    <w:basedOn w:val="Normal"/>
+    <w:basedOn w:val="a1"/>
     <w:uiPriority w:val="99"/>
     <w:unhideWhenUsed/>
     <w:rsid w:val="0029639D"/>
@@ -2473,9 +2473,9 @@
       <w:contextualSpacing/>
     </w:pPr>
   </w:style>
-  <w:style w:type="paragraph" w:styleId="ListContinue2">
+  <w:style w:type="paragraph" w:styleId="26">
     <w:name w:val="List Continue 2"/>
-    <w:basedOn w:val="Normal"/>
+    <w:basedOn w:val="a1"/>
     <w:uiPriority w:val="99"/>
     <w:unhideWhenUsed/>
     <w:rsid w:val="0029639D"/>
@@ -2485,9 +2485,9 @@
       <w:contextualSpacing/>
     </w:pPr>
   </w:style>
-  <w:style w:type="paragraph" w:styleId="ListContinue3">
+  <w:style w:type="paragraph" w:styleId="36">
     <w:name w:val="List Continue 3"/>
-    <w:basedOn w:val="Normal"/>
+    <w:basedOn w:val="a1"/>
     <w:uiPriority w:val="99"/>
     <w:unhideWhenUsed/>
     <w:rsid w:val="0029639D"/>
@@ -2497,9 +2497,9 @@
       <w:contextualSpacing/>
     </w:pPr>
   </w:style>
-  <w:style w:type="paragraph" w:styleId="MacroText">
+  <w:style w:type="paragraph" w:styleId="af3">
     <w:name w:val="macro"/>
-    <w:link w:val="MacroTextChar"/>
+    <w:link w:val="af4"/>
     <w:uiPriority w:val="99"/>
     <w:unhideWhenUsed/>
     <w:rsid w:val="0029639D"/>
@@ -2520,10 +2520,10 @@
       <w:szCs w:val="20"/>
     </w:rPr>
   </w:style>
-  <w:style w:type="character" w:customStyle="1" w:styleId="MacroTextChar">
-    <w:name w:val="Macro Text Char"/>
-    <w:basedOn w:val="DefaultParagraphFont"/>
-    <w:link w:val="MacroText"/>
+  <w:style w:type="character" w:customStyle="1" w:styleId="af4">
+    <w:name w:val="宏文本 字符"/>
+    <w:basedOn w:val="a2"/>
+    <w:link w:val="af3"/>
     <w:uiPriority w:val="99"/>
     <w:rsid w:val="0029639D"/>
     <w:rPr>
@@ -2532,11 +2532,11 @@
       <w:szCs w:val="20"/>
     </w:rPr>
   </w:style>
-  <w:style w:type="paragraph" w:styleId="Quote">
+  <w:style w:type="paragraph" w:styleId="af5">
     <w:name w:val="Quote"/>
-    <w:basedOn w:val="Normal"/>
-    <w:next w:val="Normal"/>
-    <w:link w:val="QuoteChar"/>
+    <w:basedOn w:val="a1"/>
+    <w:next w:val="a1"/>
+    <w:link w:val="af6"/>
     <w:uiPriority w:val="29"/>
     <w:qFormat/>
     <w:rsid w:val="00FC693F"/>
@@ -2546,10 +2546,10 @@
       <w:color w:val="000000" w:themeColor="text1"/>
     </w:rPr>
   </w:style>
-  <w:style w:type="character" w:customStyle="1" w:styleId="QuoteChar">
-    <w:name w:val="Quote Char"/>
-    <w:basedOn w:val="DefaultParagraphFont"/>
-    <w:link w:val="Quote"/>
+  <w:style w:type="character" w:customStyle="1" w:styleId="af6">
+    <w:name w:val="引用 字符"/>
+    <w:basedOn w:val="a2"/>
+    <w:link w:val="af5"/>
     <w:uiPriority w:val="29"/>
     <w:rsid w:val="00FC693F"/>
     <w:rPr>
@@ -2558,10 +2558,10 @@
       <w:color w:val="000000" w:themeColor="text1"/>
     </w:rPr>
   </w:style>
-  <w:style w:type="character" w:customStyle="1" w:styleId="Heading4Char">
-    <w:name w:val="Heading 4 Char"/>
-    <w:basedOn w:val="DefaultParagraphFont"/>
-    <w:link w:val="Heading4"/>
+  <w:style w:type="character" w:customStyle="1" w:styleId="40">
+    <w:name w:val="标题 4 字符"/>
+    <w:basedOn w:val="a2"/>
+    <w:link w:val="4"/>
     <w:uiPriority w:val="9"/>
     <w:semiHidden/>
     <w:rsid w:val="00FC693F"/>
@@ -2574,10 +2574,10 @@
       <w:color w:val="4F81BD" w:themeColor="accent1"/>
     </w:rPr>
   </w:style>
-  <w:style w:type="character" w:customStyle="1" w:styleId="Heading5Char">
-    <w:name w:val="Heading 5 Char"/>
-    <w:basedOn w:val="DefaultParagraphFont"/>
-    <w:link w:val="Heading5"/>
+  <w:style w:type="character" w:customStyle="1" w:styleId="50">
+    <w:name w:val="标题 5 字符"/>
+    <w:basedOn w:val="a2"/>
+    <w:link w:val="5"/>
     <w:uiPriority w:val="9"/>
     <w:semiHidden/>
     <w:rsid w:val="00FC693F"/>
@@ -2586,10 +2586,10 @@
       <w:color w:val="243F60" w:themeColor="accent1" w:themeShade="7F"/>
     </w:rPr>
   </w:style>
-  <w:style w:type="character" w:customStyle="1" w:styleId="Heading6Char">
-    <w:name w:val="Heading 6 Char"/>
-    <w:basedOn w:val="DefaultParagraphFont"/>
-    <w:link w:val="Heading6"/>
+  <w:style w:type="character" w:customStyle="1" w:styleId="60">
+    <w:name w:val="标题 6 字符"/>
+    <w:basedOn w:val="a2"/>
+    <w:link w:val="6"/>
     <w:uiPriority w:val="9"/>
     <w:semiHidden/>
     <w:rsid w:val="00FC693F"/>
@@ -2600,10 +2600,10 @@
       <w:color w:val="243F60" w:themeColor="accent1" w:themeShade="7F"/>
     </w:rPr>
   </w:style>
-  <w:style w:type="character" w:customStyle="1" w:styleId="Heading7Char">
-    <w:name w:val="Heading 7 Char"/>
-    <w:basedOn w:val="DefaultParagraphFont"/>
-    <w:link w:val="Heading7"/>
+  <w:style w:type="character" w:customStyle="1" w:styleId="70">
+    <w:name w:val="标题 7 字符"/>
+    <w:basedOn w:val="a2"/>
+    <w:link w:val="7"/>
     <w:uiPriority w:val="9"/>
     <w:semiHidden/>
     <w:rsid w:val="00FC693F"/>
@@ -2614,10 +2614,10 @@
       <w:color w:val="404040" w:themeColor="text1" w:themeTint="BF"/>
     </w:rPr>
   </w:style>
-  <w:style w:type="character" w:customStyle="1" w:styleId="Heading8Char">
-    <w:name w:val="Heading 8 Char"/>
-    <w:basedOn w:val="DefaultParagraphFont"/>
-    <w:link w:val="Heading8"/>
+  <w:style w:type="character" w:customStyle="1" w:styleId="80">
+    <w:name w:val="标题 8 字符"/>
+    <w:basedOn w:val="a2"/>
+    <w:link w:val="8"/>
     <w:uiPriority w:val="9"/>
     <w:semiHidden/>
     <w:rsid w:val="00FC693F"/>
@@ -2628,10 +2628,10 @@
       <w:szCs w:val="20"/>
     </w:rPr>
   </w:style>
-  <w:style w:type="character" w:customStyle="1" w:styleId="Heading9Char">
-    <w:name w:val="Heading 9 Char"/>
-    <w:basedOn w:val="DefaultParagraphFont"/>
-    <w:link w:val="Heading9"/>
+  <w:style w:type="character" w:customStyle="1" w:styleId="90">
+    <w:name w:val="标题 9 字符"/>
+    <w:basedOn w:val="a2"/>
+    <w:link w:val="9"/>
     <w:uiPriority w:val="9"/>
     <w:semiHidden/>
     <w:rsid w:val="00FC693F"/>
@@ -2644,10 +2644,10 @@
       <w:szCs w:val="20"/>
     </w:rPr>
   </w:style>
-  <w:style w:type="paragraph" w:styleId="Caption">
+  <w:style w:type="paragraph" w:styleId="af7">
     <w:name w:val="caption"/>
-    <w:basedOn w:val="Normal"/>
-    <w:next w:val="Normal"/>
+    <w:basedOn w:val="a1"/>
+    <w:next w:val="a1"/>
     <w:uiPriority w:val="35"/>
     <w:semiHidden/>
     <w:unhideWhenUsed/>
@@ -2664,9 +2664,9 @@
       <w:szCs w:val="18"/>
     </w:rPr>
   </w:style>
-  <w:style w:type="character" w:styleId="Strong">
+  <w:style w:type="character" w:styleId="af8">
     <w:name w:val="Strong"/>
-    <w:basedOn w:val="DefaultParagraphFont"/>
+    <w:basedOn w:val="a2"/>
     <w:uiPriority w:val="22"/>
     <w:qFormat/>
     <w:rsid w:val="00FC693F"/>
@@ -2675,9 +2675,9 @@
       <w:bCs/>
     </w:rPr>
   </w:style>
-  <w:style w:type="character" w:styleId="Emphasis">
+  <w:style w:type="character" w:styleId="af9">
     <w:name w:val="Emphasis"/>
-    <w:basedOn w:val="DefaultParagraphFont"/>
+    <w:basedOn w:val="a2"/>
     <w:uiPriority w:val="20"/>
     <w:qFormat/>
     <w:rsid w:val="00FC693F"/>
@@ -2686,11 +2686,11 @@
       <w:iCs/>
     </w:rPr>
   </w:style>
-  <w:style w:type="paragraph" w:styleId="IntenseQuote">
+  <w:style w:type="paragraph" w:styleId="afa">
     <w:name w:val="Intense Quote"/>
-    <w:basedOn w:val="Normal"/>
-    <w:next w:val="Normal"/>
-    <w:link w:val="IntenseQuoteChar"/>
+    <w:basedOn w:val="a1"/>
+    <w:next w:val="a1"/>
+    <w:link w:val="afb"/>
     <w:uiPriority w:val="30"/>
     <w:qFormat/>
     <w:rsid w:val="00FC693F"/>
@@ -2709,10 +2709,10 @@
       <w:color w:val="4F81BD" w:themeColor="accent1"/>
     </w:rPr>
   </w:style>
-  <w:style w:type="character" w:customStyle="1" w:styleId="IntenseQuoteChar">
-    <w:name w:val="Intense Quote Char"/>
-    <w:basedOn w:val="DefaultParagraphFont"/>
-    <w:link w:val="IntenseQuote"/>
+  <w:style w:type="character" w:customStyle="1" w:styleId="afb">
+    <w:name w:val="明显引用 字符"/>
+    <w:basedOn w:val="a2"/>
+    <w:link w:val="afa"/>
     <w:uiPriority w:val="30"/>
     <w:rsid w:val="00FC693F"/>
     <w:rPr>
@@ -2723,9 +2723,9 @@
       <w:color w:val="4F81BD" w:themeColor="accent1"/>
     </w:rPr>
   </w:style>
-  <w:style w:type="character" w:styleId="SubtleEmphasis">
+  <w:style w:type="character" w:styleId="afc">
     <w:name w:val="Subtle Emphasis"/>
-    <w:basedOn w:val="DefaultParagraphFont"/>
+    <w:basedOn w:val="a2"/>
     <w:uiPriority w:val="19"/>
     <w:qFormat/>
     <w:rsid w:val="00FC693F"/>
@@ -2735,9 +2735,9 @@
       <w:color w:val="808080" w:themeColor="text1" w:themeTint="7F"/>
     </w:rPr>
   </w:style>
-  <w:style w:type="character" w:styleId="IntenseEmphasis">
+  <w:style w:type="character" w:styleId="afd">
     <w:name w:val="Intense Emphasis"/>
-    <w:basedOn w:val="DefaultParagraphFont"/>
+    <w:basedOn w:val="a2"/>
     <w:uiPriority w:val="21"/>
     <w:qFormat/>
     <w:rsid w:val="00FC693F"/>
@@ -2749,9 +2749,9 @@
       <w:color w:val="4F81BD" w:themeColor="accent1"/>
     </w:rPr>
   </w:style>
-  <w:style w:type="character" w:styleId="SubtleReference">
+  <w:style w:type="character" w:styleId="afe">
     <w:name w:val="Subtle Reference"/>
-    <w:basedOn w:val="DefaultParagraphFont"/>
+    <w:basedOn w:val="a2"/>
     <w:uiPriority w:val="31"/>
     <w:qFormat/>
     <w:rsid w:val="00FC693F"/>
@@ -2761,9 +2761,9 @@
       <w:u w:val="single"/>
     </w:rPr>
   </w:style>
-  <w:style w:type="character" w:styleId="IntenseReference">
+  <w:style w:type="character" w:styleId="aff">
     <w:name w:val="Intense Reference"/>
-    <w:basedOn w:val="DefaultParagraphFont"/>
+    <w:basedOn w:val="a2"/>
     <w:uiPriority w:val="32"/>
     <w:qFormat/>
     <w:rsid w:val="00FC693F"/>
@@ -2776,9 +2776,9 @@
       <w:u w:val="single"/>
     </w:rPr>
   </w:style>
-  <w:style w:type="character" w:styleId="BookTitle">
+  <w:style w:type="character" w:styleId="aff0">
     <w:name w:val="Book Title"/>
-    <w:basedOn w:val="DefaultParagraphFont"/>
+    <w:basedOn w:val="a2"/>
     <w:uiPriority w:val="33"/>
     <w:qFormat/>
     <w:rsid w:val="00FC693F"/>
@@ -2789,10 +2789,10 @@
       <w:spacing w:val="5"/>
     </w:rPr>
   </w:style>
-  <w:style w:type="paragraph" w:styleId="TOCHeading">
+  <w:style w:type="paragraph" w:styleId="TOC">
     <w:name w:val="TOC Heading"/>
-    <w:basedOn w:val="Heading1"/>
-    <w:next w:val="Normal"/>
+    <w:basedOn w:val="1"/>
+    <w:next w:val="a1"/>
     <w:uiPriority w:val="39"/>
     <w:semiHidden/>
     <w:unhideWhenUsed/>
@@ -2802,9 +2802,9 @@
       <w:outlineLvl w:val="9"/>
     </w:pPr>
   </w:style>
-  <w:style w:type="table" w:styleId="TableGrid">
+  <w:style w:type="table" w:styleId="aff1">
     <w:name w:val="Table Grid"/>
-    <w:basedOn w:val="TableNormal"/>
+    <w:basedOn w:val="a3"/>
     <w:uiPriority w:val="59"/>
     <w:rsid w:val="00FC693F"/>
     <w:pPr>
@@ -2821,9 +2821,9 @@
       </w:tblBorders>
     </w:tblPr>
   </w:style>
-  <w:style w:type="table" w:styleId="LightShading">
+  <w:style w:type="table" w:styleId="aff2">
     <w:name w:val="Light Shading"/>
-    <w:basedOn w:val="TableNormal"/>
+    <w:basedOn w:val="a3"/>
     <w:uiPriority w:val="60"/>
     <w:rsid w:val="00FC693F"/>
     <w:pPr>
@@ -2917,9 +2917,9 @@
       </w:tcPr>
     </w:tblStylePr>
   </w:style>
-  <w:style w:type="table" w:styleId="LightShading-Accent1">
+  <w:style w:type="table" w:styleId="-1">
     <w:name w:val="Light Shading Accent 1"/>
-    <w:basedOn w:val="TableNormal"/>
+    <w:basedOn w:val="a3"/>
     <w:uiPriority w:val="60"/>
     <w:rsid w:val="00FC693F"/>
     <w:pPr>
@@ -3013,9 +3013,9 @@
       </w:tcPr>
     </w:tblStylePr>
   </w:style>
-  <w:style w:type="table" w:styleId="LightShading-Accent2">
+  <w:style w:type="table" w:styleId="-2">
     <w:name w:val="Light Shading Accent 2"/>
-    <w:basedOn w:val="TableNormal"/>
+    <w:basedOn w:val="a3"/>
     <w:uiPriority w:val="60"/>
     <w:rsid w:val="00FC693F"/>
     <w:pPr>
@@ -3109,9 +3109,9 @@
       </w:tcPr>
     </w:tblStylePr>
   </w:style>
-  <w:style w:type="table" w:styleId="LightShading-Accent3">
+  <w:style w:type="table" w:styleId="-3">
     <w:name w:val="Light Shading Accent 3"/>
-    <w:basedOn w:val="TableNormal"/>
+    <w:basedOn w:val="a3"/>
     <w:uiPriority w:val="60"/>
     <w:rsid w:val="00FC693F"/>
     <w:pPr>
@@ -3205,9 +3205,9 @@
       </w:tcPr>
     </w:tblStylePr>
   </w:style>
-  <w:style w:type="table" w:styleId="LightShading-Accent4">
+  <w:style w:type="table" w:styleId="-4">
     <w:name w:val="Light Shading Accent 4"/>
-    <w:basedOn w:val="TableNormal"/>
+    <w:basedOn w:val="a3"/>
     <w:uiPriority w:val="60"/>
     <w:rsid w:val="00FC693F"/>
     <w:pPr>
@@ -3301,9 +3301,9 @@
       </w:tcPr>
     </w:tblStylePr>
   </w:style>
-  <w:style w:type="table" w:styleId="LightShading-Accent5">
+  <w:style w:type="table" w:styleId="-5">
     <w:name w:val="Light Shading Accent 5"/>
-    <w:basedOn w:val="TableNormal"/>
+    <w:basedOn w:val="a3"/>
     <w:uiPriority w:val="60"/>
     <w:rsid w:val="00FC693F"/>
     <w:pPr>
@@ -3397,9 +3397,9 @@
       </w:tcPr>
     </w:tblStylePr>
   </w:style>
-  <w:style w:type="table" w:styleId="LightShading-Accent6">
+  <w:style w:type="table" w:styleId="-6">
     <w:name w:val="Light Shading Accent 6"/>
-    <w:basedOn w:val="TableNormal"/>
+    <w:basedOn w:val="a3"/>
     <w:uiPriority w:val="60"/>
     <w:rsid w:val="00FC693F"/>
     <w:pPr>
@@ -3493,9 +3493,9 @@
       </w:tcPr>
     </w:tblStylePr>
   </w:style>
-  <w:style w:type="table" w:styleId="LightList">
+  <w:style w:type="table" w:styleId="aff3">
     <w:name w:val="Light List"/>
-    <w:basedOn w:val="TableNormal"/>
+    <w:basedOn w:val="a3"/>
     <w:uiPriority w:val="61"/>
     <w:rsid w:val="00FC693F"/>
     <w:pPr>
@@ -3578,9 +3578,9 @@
       </w:tcPr>
     </w:tblStylePr>
   </w:style>
-  <w:style w:type="table" w:styleId="LightList-Accent1">
+  <w:style w:type="table" w:styleId="-10">
     <w:name w:val="Light List Accent 1"/>
-    <w:basedOn w:val="TableNormal"/>
+    <w:basedOn w:val="a3"/>
     <w:uiPriority w:val="61"/>
     <w:rsid w:val="00FC693F"/>
     <w:pPr>
@@ -3663,9 +3663,9 @@
       </w:tcPr>
     </w:tblStylePr>
   </w:style>
-  <w:style w:type="table" w:styleId="LightList-Accent2">
+  <w:style w:type="table" w:styleId="-20">
     <w:name w:val="Light List Accent 2"/>
-    <w:basedOn w:val="TableNormal"/>
+    <w:basedOn w:val="a3"/>
     <w:uiPriority w:val="61"/>
     <w:rsid w:val="00CB0664"/>
     <w:pPr>
@@ -3748,9 +3748,9 @@
       </w:tcPr>
     </w:tblStylePr>
   </w:style>
-  <w:style w:type="table" w:styleId="LightList-Accent3">
+  <w:style w:type="table" w:styleId="-30">
     <w:name w:val="Light List Accent 3"/>
-    <w:basedOn w:val="TableNormal"/>
+    <w:basedOn w:val="a3"/>
     <w:uiPriority w:val="61"/>
     <w:rsid w:val="00CB0664"/>
     <w:pPr>
@@ -3833,9 +3833,9 @@
       </w:tcPr>
     </w:tblStylePr>
   </w:style>
-  <w:style w:type="table" w:styleId="LightList-Accent4">
+  <w:style w:type="table" w:styleId="-40">
     <w:name w:val="Light List Accent 4"/>
-    <w:basedOn w:val="TableNormal"/>
+    <w:basedOn w:val="a3"/>
     <w:uiPriority w:val="61"/>
     <w:rsid w:val="00CB0664"/>
     <w:pPr>
@@ -3918,9 +3918,9 @@
       </w:tcPr>
     </w:tblStylePr>
   </w:style>
-  <w:style w:type="table" w:styleId="LightList-Accent5">
+  <w:style w:type="table" w:styleId="-50">
     <w:name w:val="Light List Accent 5"/>
-    <w:basedOn w:val="TableNormal"/>
+    <w:basedOn w:val="a3"/>
     <w:uiPriority w:val="61"/>
     <w:rsid w:val="00CB0664"/>
     <w:pPr>
@@ -4003,9 +4003,9 @@
       </w:tcPr>
     </w:tblStylePr>
   </w:style>
-  <w:style w:type="table" w:styleId="LightList-Accent6">
+  <w:style w:type="table" w:styleId="-60">
     <w:name w:val="Light List Accent 6"/>
-    <w:basedOn w:val="TableNormal"/>
+    <w:basedOn w:val="a3"/>
     <w:uiPriority w:val="61"/>
     <w:rsid w:val="00CB0664"/>
     <w:pPr>
@@ -4088,9 +4088,9 @@
       </w:tcPr>
     </w:tblStylePr>
   </w:style>
-  <w:style w:type="table" w:styleId="LightGrid">
+  <w:style w:type="table" w:styleId="aff4">
     <w:name w:val="Light Grid"/>
-    <w:basedOn w:val="TableNormal"/>
+    <w:basedOn w:val="a3"/>
     <w:uiPriority w:val="62"/>
     <w:rsid w:val="00CB0664"/>
     <w:pPr>
@@ -4211,9 +4211,9 @@
       </w:tcPr>
     </w:tblStylePr>
   </w:style>
-  <w:style w:type="table" w:styleId="LightGrid-Accent1">
+  <w:style w:type="table" w:styleId="-11">
     <w:name w:val="Light Grid Accent 1"/>
-    <w:basedOn w:val="TableNormal"/>
+    <w:basedOn w:val="a3"/>
     <w:uiPriority w:val="62"/>
     <w:rsid w:val="00CB0664"/>
     <w:pPr>
@@ -4334,9 +4334,9 @@
       </w:tcPr>
     </w:tblStylePr>
   </w:style>
-  <w:style w:type="table" w:styleId="LightGrid-Accent2">
+  <w:style w:type="table" w:styleId="-21">
     <w:name w:val="Light Grid Accent 2"/>
-    <w:basedOn w:val="TableNormal"/>
+    <w:basedOn w:val="a3"/>
     <w:uiPriority w:val="62"/>
     <w:rsid w:val="00CB0664"/>
     <w:pPr>
@@ -4457,9 +4457,9 @@
       </w:tcPr>
     </w:tblStylePr>
   </w:style>
-  <w:style w:type="table" w:styleId="LightGrid-Accent3">
+  <w:style w:type="table" w:styleId="-31">
     <w:name w:val="Light Grid Accent 3"/>
-    <w:basedOn w:val="TableNormal"/>
+    <w:basedOn w:val="a3"/>
     <w:uiPriority w:val="62"/>
     <w:rsid w:val="00CB0664"/>
     <w:pPr>
@@ -4580,9 +4580,9 @@
       </w:tcPr>
     </w:tblStylePr>
   </w:style>
-  <w:style w:type="table" w:styleId="LightGrid-Accent4">
+  <w:style w:type="table" w:styleId="-41">
     <w:name w:val="Light Grid Accent 4"/>
-    <w:basedOn w:val="TableNormal"/>
+    <w:basedOn w:val="a3"/>
     <w:uiPriority w:val="62"/>
     <w:rsid w:val="00CB0664"/>
     <w:pPr>
@@ -4703,9 +4703,9 @@
       </w:tcPr>
     </w:tblStylePr>
   </w:style>
-  <w:style w:type="table" w:styleId="LightGrid-Accent5">
+  <w:style w:type="table" w:styleId="-51">
     <w:name w:val="Light Grid Accent 5"/>
-    <w:basedOn w:val="TableNormal"/>
+    <w:basedOn w:val="a3"/>
     <w:uiPriority w:val="62"/>
     <w:rsid w:val="00CB0664"/>
     <w:pPr>
@@ -4826,9 +4826,9 @@
       </w:tcPr>
     </w:tblStylePr>
   </w:style>
-  <w:style w:type="table" w:styleId="LightGrid-Accent6">
+  <w:style w:type="table" w:styleId="-61">
     <w:name w:val="Light Grid Accent 6"/>
-    <w:basedOn w:val="TableNormal"/>
+    <w:basedOn w:val="a3"/>
     <w:uiPriority w:val="62"/>
     <w:rsid w:val="00CB0664"/>
     <w:pPr>
@@ -4949,9 +4949,9 @@
       </w:tcPr>
     </w:tblStylePr>
   </w:style>
-  <w:style w:type="table" w:styleId="MediumShading1">
+  <w:style w:type="table" w:styleId="11">
     <w:name w:val="Medium Shading 1"/>
-    <w:basedOn w:val="TableNormal"/>
+    <w:basedOn w:val="a3"/>
     <w:uiPriority w:val="63"/>
     <w:rsid w:val="00CB0664"/>
     <w:pPr>
@@ -5048,9 +5048,9 @@
       </w:tcPr>
     </w:tblStylePr>
   </w:style>
-  <w:style w:type="table" w:styleId="MediumShading1-Accent1">
+  <w:style w:type="table" w:styleId="1-1">
     <w:name w:val="Medium Shading 1 Accent 1"/>
-    <w:basedOn w:val="TableNormal"/>
+    <w:basedOn w:val="a3"/>
     <w:uiPriority w:val="63"/>
     <w:rsid w:val="00CB0664"/>
     <w:pPr>
@@ -5147,9 +5147,9 @@
       </w:tcPr>
     </w:tblStylePr>
   </w:style>
-  <w:style w:type="table" w:styleId="MediumShading1-Accent2">
+  <w:style w:type="table" w:styleId="1-2">
     <w:name w:val="Medium Shading 1 Accent 2"/>
-    <w:basedOn w:val="TableNormal"/>
+    <w:basedOn w:val="a3"/>
     <w:uiPriority w:val="63"/>
     <w:rsid w:val="00CB0664"/>
     <w:pPr>
@@ -5246,9 +5246,9 @@
       </w:tcPr>
     </w:tblStylePr>
   </w:style>
-  <w:style w:type="table" w:styleId="MediumShading1-Accent3">
+  <w:style w:type="table" w:styleId="1-3">
     <w:name w:val="Medium Shading 1 Accent 3"/>
-    <w:basedOn w:val="TableNormal"/>
+    <w:basedOn w:val="a3"/>
     <w:uiPriority w:val="63"/>
     <w:rsid w:val="00CB0664"/>
     <w:pPr>
@@ -5345,9 +5345,9 @@
       </w:tcPr>
     </w:tblStylePr>
   </w:style>
-  <w:style w:type="table" w:styleId="MediumShading1-Accent4">
+  <w:style w:type="table" w:styleId="1-4">
     <w:name w:val="Medium Shading 1 Accent 4"/>
-    <w:basedOn w:val="TableNormal"/>
+    <w:basedOn w:val="a3"/>
     <w:uiPriority w:val="63"/>
     <w:rsid w:val="00CB0664"/>
     <w:pPr>
@@ -5444,9 +5444,9 @@
       </w:tcPr>
     </w:tblStylePr>
   </w:style>
-  <w:style w:type="table" w:styleId="MediumShading1-Accent5">
+  <w:style w:type="table" w:styleId="1-5">
     <w:name w:val="Medium Shading 1 Accent 5"/>
-    <w:basedOn w:val="TableNormal"/>
+    <w:basedOn w:val="a3"/>
     <w:uiPriority w:val="63"/>
     <w:rsid w:val="00CB0664"/>
     <w:pPr>
@@ -5543,9 +5543,9 @@
       </w:tcPr>
     </w:tblStylePr>
   </w:style>
-  <w:style w:type="table" w:styleId="MediumShading1-Accent6">
+  <w:style w:type="table" w:styleId="1-6">
     <w:name w:val="Medium Shading 1 Accent 6"/>
-    <w:basedOn w:val="TableNormal"/>
+    <w:basedOn w:val="a3"/>
     <w:uiPriority w:val="63"/>
     <w:rsid w:val="00CB0664"/>
     <w:pPr>
@@ -5642,9 +5642,9 @@
       </w:tcPr>
     </w:tblStylePr>
   </w:style>
-  <w:style w:type="table" w:styleId="MediumShading2">
+  <w:style w:type="table" w:styleId="27">
     <w:name w:val="Medium Shading 2"/>
-    <w:basedOn w:val="TableNormal"/>
+    <w:basedOn w:val="a3"/>
     <w:uiPriority w:val="64"/>
     <w:rsid w:val="00CB0664"/>
     <w:pPr>
@@ -5784,9 +5784,9 @@
       </w:tcPr>
     </w:tblStylePr>
   </w:style>
-  <w:style w:type="table" w:styleId="MediumShading2-Accent1">
+  <w:style w:type="table" w:styleId="2-1">
     <w:name w:val="Medium Shading 2 Accent 1"/>
-    <w:basedOn w:val="TableNormal"/>
+    <w:basedOn w:val="a3"/>
     <w:uiPriority w:val="64"/>
     <w:rsid w:val="00CB0664"/>
     <w:pPr>
@@ -5926,9 +5926,9 @@
       </w:tcPr>
     </w:tblStylePr>
   </w:style>
-  <w:style w:type="table" w:styleId="MediumShading2-Accent2">
+  <w:style w:type="table" w:styleId="2-2">
     <w:name w:val="Medium Shading 2 Accent 2"/>
-    <w:basedOn w:val="TableNormal"/>
+    <w:basedOn w:val="a3"/>
     <w:uiPriority w:val="64"/>
     <w:rsid w:val="00CB0664"/>
     <w:pPr>
@@ -6068,9 +6068,9 @@
       </w:tcPr>
     </w:tblStylePr>
   </w:style>
-  <w:style w:type="table" w:styleId="MediumShading2-Accent3">
+  <w:style w:type="table" w:styleId="2-3">
     <w:name w:val="Medium Shading 2 Accent 3"/>
-    <w:basedOn w:val="TableNormal"/>
+    <w:basedOn w:val="a3"/>
     <w:uiPriority w:val="64"/>
     <w:rsid w:val="00CB0664"/>
     <w:pPr>
@@ -6210,9 +6210,9 @@
       </w:tcPr>
     </w:tblStylePr>
   </w:style>
-  <w:style w:type="table" w:styleId="MediumShading2-Accent4">
+  <w:style w:type="table" w:styleId="2-4">
     <w:name w:val="Medium Shading 2 Accent 4"/>
-    <w:basedOn w:val="TableNormal"/>
+    <w:basedOn w:val="a3"/>
     <w:uiPriority w:val="64"/>
     <w:rsid w:val="00CB0664"/>
     <w:pPr>
@@ -6352,9 +6352,9 @@
       </w:tcPr>
     </w:tblStylePr>
   </w:style>
-  <w:style w:type="table" w:styleId="MediumShading2-Accent5">
+  <w:style w:type="table" w:styleId="2-5">
     <w:name w:val="Medium Shading 2 Accent 5"/>
-    <w:basedOn w:val="TableNormal"/>
+    <w:basedOn w:val="a3"/>
     <w:uiPriority w:val="64"/>
     <w:rsid w:val="00CB0664"/>
     <w:pPr>
@@ -6494,9 +6494,9 @@
       </w:tcPr>
     </w:tblStylePr>
   </w:style>
-  <w:style w:type="table" w:styleId="MediumShading2-Accent6">
+  <w:style w:type="table" w:styleId="2-6">
     <w:name w:val="Medium Shading 2 Accent 6"/>
-    <w:basedOn w:val="TableNormal"/>
+    <w:basedOn w:val="a3"/>
     <w:uiPriority w:val="64"/>
     <w:rsid w:val="00CB0664"/>
     <w:pPr>
@@ -6636,9 +6636,9 @@
       </w:tcPr>
     </w:tblStylePr>
   </w:style>
-  <w:style w:type="table" w:styleId="MediumList1">
+  <w:style w:type="table" w:styleId="12">
     <w:name w:val="Medium List 1"/>
-    <w:basedOn w:val="TableNormal"/>
+    <w:basedOn w:val="a3"/>
     <w:uiPriority w:val="65"/>
     <w:rsid w:val="00CB0664"/>
     <w:pPr>
@@ -6713,9 +6713,9 @@
       </w:tcPr>
     </w:tblStylePr>
   </w:style>
-  <w:style w:type="table" w:styleId="MediumList1-Accent1">
+  <w:style w:type="table" w:styleId="1-10">
     <w:name w:val="Medium List 1 Accent 1"/>
-    <w:basedOn w:val="TableNormal"/>
+    <w:basedOn w:val="a3"/>
     <w:uiPriority w:val="65"/>
     <w:rsid w:val="00CB0664"/>
     <w:pPr>
@@ -6790,9 +6790,9 @@
       </w:tcPr>
     </w:tblStylePr>
   </w:style>
-  <w:style w:type="table" w:styleId="MediumList1-Accent2">
+  <w:style w:type="table" w:styleId="1-20">
     <w:name w:val="Medium List 1 Accent 2"/>
-    <w:basedOn w:val="TableNormal"/>
+    <w:basedOn w:val="a3"/>
     <w:uiPriority w:val="65"/>
     <w:rsid w:val="00CB0664"/>
     <w:pPr>
@@ -6867,9 +6867,9 @@
       </w:tcPr>
     </w:tblStylePr>
   </w:style>
-  <w:style w:type="table" w:styleId="MediumList1-Accent3">
+  <w:style w:type="table" w:styleId="1-30">
     <w:name w:val="Medium List 1 Accent 3"/>
-    <w:basedOn w:val="TableNormal"/>
+    <w:basedOn w:val="a3"/>
     <w:uiPriority w:val="65"/>
     <w:rsid w:val="00CB0664"/>
     <w:pPr>
@@ -6944,9 +6944,9 @@
       </w:tcPr>
     </w:tblStylePr>
   </w:style>
-  <w:style w:type="table" w:styleId="MediumList1-Accent4">
+  <w:style w:type="table" w:styleId="1-40">
     <w:name w:val="Medium List 1 Accent 4"/>
-    <w:basedOn w:val="TableNormal"/>
+    <w:basedOn w:val="a3"/>
     <w:uiPriority w:val="65"/>
     <w:rsid w:val="00CB0664"/>
     <w:pPr>
@@ -7021,9 +7021,9 @@
       </w:tcPr>
     </w:tblStylePr>
   </w:style>
-  <w:style w:type="table" w:styleId="MediumList1-Accent5">
+  <w:style w:type="table" w:styleId="1-50">
     <w:name w:val="Medium List 1 Accent 5"/>
-    <w:basedOn w:val="TableNormal"/>
+    <w:basedOn w:val="a3"/>
     <w:uiPriority w:val="65"/>
     <w:rsid w:val="00CB0664"/>
     <w:pPr>
@@ -7098,9 +7098,9 @@
       </w:tcPr>
     </w:tblStylePr>
   </w:style>
-  <w:style w:type="table" w:styleId="MediumList1-Accent6">
+  <w:style w:type="table" w:styleId="1-60">
     <w:name w:val="Medium List 1 Accent 6"/>
-    <w:basedOn w:val="TableNormal"/>
+    <w:basedOn w:val="a3"/>
     <w:uiPriority w:val="65"/>
     <w:rsid w:val="00CB0664"/>
     <w:pPr>
@@ -7175,9 +7175,9 @@
       </w:tcPr>
     </w:tblStylePr>
   </w:style>
-  <w:style w:type="table" w:styleId="MediumList2">
+  <w:style w:type="table" w:styleId="28">
     <w:name w:val="Medium List 2"/>
-    <w:basedOn w:val="TableNormal"/>
+    <w:basedOn w:val="a3"/>
     <w:uiPriority w:val="66"/>
     <w:rsid w:val="00CB0664"/>
     <w:pPr>
@@ -7296,9 +7296,9 @@
       </w:tcPr>
     </w:tblStylePr>
   </w:style>
-  <w:style w:type="table" w:styleId="MediumList2-Accent1">
+  <w:style w:type="table" w:styleId="2-10">
     <w:name w:val="Medium List 2 Accent 1"/>
-    <w:basedOn w:val="TableNormal"/>
+    <w:basedOn w:val="a3"/>
     <w:uiPriority w:val="66"/>
     <w:rsid w:val="00CB0664"/>
     <w:pPr>
@@ -7417,9 +7417,9 @@
       </w:tcPr>
     </w:tblStylePr>
   </w:style>
-  <w:style w:type="table" w:styleId="MediumList2-Accent2">
+  <w:style w:type="table" w:styleId="2-20">
     <w:name w:val="Medium List 2 Accent 2"/>
-    <w:basedOn w:val="TableNormal"/>
+    <w:basedOn w:val="a3"/>
     <w:uiPriority w:val="66"/>
     <w:rsid w:val="00CB0664"/>
     <w:pPr>
@@ -7538,9 +7538,9 @@
       </w:tcPr>
     </w:tblStylePr>
   </w:style>
-  <w:style w:type="table" w:styleId="MediumList2-Accent3">
+  <w:style w:type="table" w:styleId="2-30">
     <w:name w:val="Medium List 2 Accent 3"/>
-    <w:basedOn w:val="TableNormal"/>
+    <w:basedOn w:val="a3"/>
     <w:uiPriority w:val="66"/>
     <w:rsid w:val="00CB0664"/>
     <w:pPr>
@@ -7659,9 +7659,9 @@
       </w:tcPr>
     </w:tblStylePr>
   </w:style>
-  <w:style w:type="table" w:styleId="MediumList2-Accent4">
+  <w:style w:type="table" w:styleId="2-40">
     <w:name w:val="Medium List 2 Accent 4"/>
-    <w:basedOn w:val="TableNormal"/>
+    <w:basedOn w:val="a3"/>
     <w:uiPriority w:val="66"/>
     <w:rsid w:val="00CB0664"/>
     <w:pPr>
@@ -7780,9 +7780,9 @@
       </w:tcPr>
     </w:tblStylePr>
   </w:style>
-  <w:style w:type="table" w:styleId="MediumList2-Accent5">
+  <w:style w:type="table" w:styleId="2-50">
     <w:name w:val="Medium List 2 Accent 5"/>
-    <w:basedOn w:val="TableNormal"/>
+    <w:basedOn w:val="a3"/>
     <w:uiPriority w:val="66"/>
     <w:rsid w:val="00CB0664"/>
     <w:pPr>
@@ -7901,9 +7901,9 @@
       </w:tcPr>
     </w:tblStylePr>
   </w:style>
-  <w:style w:type="table" w:styleId="MediumList2-Accent6">
+  <w:style w:type="table" w:styleId="2-60">
     <w:name w:val="Medium List 2 Accent 6"/>
-    <w:basedOn w:val="TableNormal"/>
+    <w:basedOn w:val="a3"/>
     <w:uiPriority w:val="66"/>
     <w:rsid w:val="00CB0664"/>
     <w:pPr>
@@ -8022,9 +8022,9 @@
       </w:tcPr>
     </w:tblStylePr>
   </w:style>
-  <w:style w:type="table" w:styleId="MediumGrid1">
+  <w:style w:type="table" w:styleId="13">
     <w:name w:val="Medium Grid 1"/>
-    <w:basedOn w:val="TableNormal"/>
+    <w:basedOn w:val="a3"/>
     <w:uiPriority w:val="67"/>
     <w:rsid w:val="00CB0664"/>
     <w:pPr>
@@ -8088,9 +8088,9 @@
       </w:tcPr>
     </w:tblStylePr>
   </w:style>
-  <w:style w:type="table" w:styleId="MediumGrid1-Accent1">
+  <w:style w:type="table" w:styleId="1-11">
     <w:name w:val="Medium Grid 1 Accent 1"/>
-    <w:basedOn w:val="TableNormal"/>
+    <w:basedOn w:val="a3"/>
     <w:uiPriority w:val="67"/>
     <w:rsid w:val="00CB0664"/>
     <w:pPr>
@@ -8154,9 +8154,9 @@
       </w:tcPr>
     </w:tblStylePr>
   </w:style>
-  <w:style w:type="table" w:styleId="MediumGrid1-Accent2">
+  <w:style w:type="table" w:styleId="1-21">
     <w:name w:val="Medium Grid 1 Accent 2"/>
-    <w:basedOn w:val="TableNormal"/>
+    <w:basedOn w:val="a3"/>
     <w:uiPriority w:val="67"/>
     <w:rsid w:val="00CB0664"/>
     <w:pPr>
@@ -8220,9 +8220,9 @@
       </w:tcPr>
     </w:tblStylePr>
   </w:style>
-  <w:style w:type="table" w:styleId="MediumGrid1-Accent3">
+  <w:style w:type="table" w:styleId="1-31">
     <w:name w:val="Medium Grid 1 Accent 3"/>
-    <w:basedOn w:val="TableNormal"/>
+    <w:basedOn w:val="a3"/>
     <w:uiPriority w:val="67"/>
     <w:rsid w:val="00CB0664"/>
     <w:pPr>
@@ -8286,9 +8286,9 @@
       </w:tcPr>
     </w:tblStylePr>
   </w:style>
-  <w:style w:type="table" w:styleId="MediumGrid1-Accent4">
+  <w:style w:type="table" w:styleId="1-41">
     <w:name w:val="Medium Grid 1 Accent 4"/>
-    <w:basedOn w:val="TableNormal"/>
+    <w:basedOn w:val="a3"/>
     <w:uiPriority w:val="67"/>
     <w:rsid w:val="00CB0664"/>
     <w:pPr>
@@ -8352,9 +8352,9 @@
       </w:tcPr>
     </w:tblStylePr>
   </w:style>
-  <w:style w:type="table" w:styleId="MediumGrid1-Accent5">
+  <w:style w:type="table" w:styleId="1-51">
     <w:name w:val="Medium Grid 1 Accent 5"/>
-    <w:basedOn w:val="TableNormal"/>
+    <w:basedOn w:val="a3"/>
     <w:uiPriority w:val="67"/>
     <w:rsid w:val="00CB0664"/>
     <w:pPr>
@@ -8418,9 +8418,9 @@
       </w:tcPr>
     </w:tblStylePr>
   </w:style>
-  <w:style w:type="table" w:styleId="MediumGrid1-Accent6">
+  <w:style w:type="table" w:styleId="1-61">
     <w:name w:val="Medium Grid 1 Accent 6"/>
-    <w:basedOn w:val="TableNormal"/>
+    <w:basedOn w:val="a3"/>
     <w:uiPriority w:val="67"/>
     <w:rsid w:val="00CB0664"/>
     <w:pPr>
@@ -8484,9 +8484,9 @@
       </w:tcPr>
     </w:tblStylePr>
   </w:style>
-  <w:style w:type="table" w:styleId="MediumGrid2">
+  <w:style w:type="table" w:styleId="29">
     <w:name w:val="Medium Grid 2"/>
-    <w:basedOn w:val="TableNormal"/>
+    <w:basedOn w:val="a3"/>
     <w:uiPriority w:val="68"/>
     <w:rsid w:val="00CB0664"/>
     <w:pPr>
@@ -8602,9 +8602,9 @@
       </w:tcPr>
     </w:tblStylePr>
   </w:style>
-  <w:style w:type="table" w:styleId="MediumGrid2-Accent1">
+  <w:style w:type="table" w:styleId="2-11">
     <w:name w:val="Medium Grid 2 Accent 1"/>
-    <w:basedOn w:val="TableNormal"/>
+    <w:basedOn w:val="a3"/>
     <w:uiPriority w:val="68"/>
     <w:rsid w:val="00CB0664"/>
     <w:pPr>
@@ -8720,9 +8720,9 @@
       </w:tcPr>
     </w:tblStylePr>
   </w:style>
-  <w:style w:type="table" w:styleId="MediumGrid2-Accent2">
+  <w:style w:type="table" w:styleId="2-21">
     <w:name w:val="Medium Grid 2 Accent 2"/>
-    <w:basedOn w:val="TableNormal"/>
+    <w:basedOn w:val="a3"/>
     <w:uiPriority w:val="68"/>
     <w:rsid w:val="00CB0664"/>
     <w:pPr>
@@ -8838,9 +8838,9 @@
       </w:tcPr>
     </w:tblStylePr>
   </w:style>
-  <w:style w:type="table" w:styleId="MediumGrid2-Accent3">
+  <w:style w:type="table" w:styleId="2-31">
     <w:name w:val="Medium Grid 2 Accent 3"/>
-    <w:basedOn w:val="TableNormal"/>
+    <w:basedOn w:val="a3"/>
     <w:uiPriority w:val="68"/>
     <w:rsid w:val="00CB0664"/>
     <w:pPr>
@@ -8956,9 +8956,9 @@
       </w:tcPr>
     </w:tblStylePr>
   </w:style>
-  <w:style w:type="table" w:styleId="MediumGrid2-Accent4">
+  <w:style w:type="table" w:styleId="2-41">
     <w:name w:val="Medium Grid 2 Accent 4"/>
-    <w:basedOn w:val="TableNormal"/>
+    <w:basedOn w:val="a3"/>
     <w:uiPriority w:val="68"/>
     <w:rsid w:val="00CB0664"/>
     <w:pPr>
@@ -9074,9 +9074,9 @@
       </w:tcPr>
     </w:tblStylePr>
   </w:style>
-  <w:style w:type="table" w:styleId="MediumGrid2-Accent5">
+  <w:style w:type="table" w:styleId="2-51">
     <w:name w:val="Medium Grid 2 Accent 5"/>
-    <w:basedOn w:val="TableNormal"/>
+    <w:basedOn w:val="a3"/>
     <w:uiPriority w:val="68"/>
     <w:rsid w:val="00CB0664"/>
     <w:pPr>
@@ -9192,9 +9192,9 @@
       </w:tcPr>
     </w:tblStylePr>
   </w:style>
-  <w:style w:type="table" w:styleId="MediumGrid2-Accent6">
+  <w:style w:type="table" w:styleId="2-61">
     <w:name w:val="Medium Grid 2 Accent 6"/>
-    <w:basedOn w:val="TableNormal"/>
+    <w:basedOn w:val="a3"/>
     <w:uiPriority w:val="68"/>
     <w:rsid w:val="00CB0664"/>
     <w:pPr>
@@ -9310,9 +9310,9 @@
       </w:tcPr>
     </w:tblStylePr>
   </w:style>
-  <w:style w:type="table" w:styleId="MediumGrid3">
+  <w:style w:type="table" w:styleId="37">
     <w:name w:val="Medium Grid 3"/>
-    <w:basedOn w:val="TableNormal"/>
+    <w:basedOn w:val="a3"/>
     <w:uiPriority w:val="69"/>
     <w:rsid w:val="00CB0664"/>
     <w:pPr>
@@ -9444,9 +9444,9 @@
       </w:tcPr>
     </w:tblStylePr>
   </w:style>
-  <w:style w:type="table" w:styleId="MediumGrid3-Accent1">
+  <w:style w:type="table" w:styleId="3-1">
     <w:name w:val="Medium Grid 3 Accent 1"/>
-    <w:basedOn w:val="TableNormal"/>
+    <w:basedOn w:val="a3"/>
     <w:uiPriority w:val="69"/>
     <w:rsid w:val="00CB0664"/>
     <w:pPr>
@@ -9578,9 +9578,9 @@
       </w:tcPr>
     </w:tblStylePr>
   </w:style>
-  <w:style w:type="table" w:styleId="MediumGrid3-Accent2">
+  <w:style w:type="table" w:styleId="3-2">
     <w:name w:val="Medium Grid 3 Accent 2"/>
-    <w:basedOn w:val="TableNormal"/>
+    <w:basedOn w:val="a3"/>
     <w:uiPriority w:val="69"/>
     <w:rsid w:val="00CB0664"/>
     <w:pPr>
@@ -9712,9 +9712,9 @@
       </w:tcPr>
     </w:tblStylePr>
   </w:style>
-  <w:style w:type="table" w:styleId="MediumGrid3-Accent3">
+  <w:style w:type="table" w:styleId="3-3">
     <w:name w:val="Medium Grid 3 Accent 3"/>
-    <w:basedOn w:val="TableNormal"/>
+    <w:basedOn w:val="a3"/>
     <w:uiPriority w:val="69"/>
     <w:rsid w:val="00CB0664"/>
     <w:pPr>
@@ -9846,9 +9846,9 @@
       </w:tcPr>
     </w:tblStylePr>
   </w:style>
-  <w:style w:type="table" w:styleId="MediumGrid3-Accent4">
+  <w:style w:type="table" w:styleId="3-4">
     <w:name w:val="Medium Grid 3 Accent 4"/>
-    <w:basedOn w:val="TableNormal"/>
+    <w:basedOn w:val="a3"/>
     <w:uiPriority w:val="69"/>
     <w:rsid w:val="00CB0664"/>
     <w:pPr>
@@ -9980,9 +9980,9 @@
       </w:tcPr>
     </w:tblStylePr>
   </w:style>
-  <w:style w:type="table" w:styleId="MediumGrid3-Accent5">
+  <w:style w:type="table" w:styleId="3-5">
     <w:name w:val="Medium Grid 3 Accent 5"/>
-    <w:basedOn w:val="TableNormal"/>
+    <w:basedOn w:val="a3"/>
     <w:uiPriority w:val="69"/>
     <w:rsid w:val="00CB0664"/>
     <w:pPr>
@@ -10114,9 +10114,9 @@
       </w:tcPr>
     </w:tblStylePr>
   </w:style>
-  <w:style w:type="table" w:styleId="MediumGrid3-Accent6">
+  <w:style w:type="table" w:styleId="3-6">
     <w:name w:val="Medium Grid 3 Accent 6"/>
-    <w:basedOn w:val="TableNormal"/>
+    <w:basedOn w:val="a3"/>
     <w:uiPriority w:val="69"/>
     <w:rsid w:val="00CB0664"/>
     <w:pPr>
@@ -10248,9 +10248,9 @@
       </w:tcPr>
     </w:tblStylePr>
   </w:style>
-  <w:style w:type="table" w:styleId="DarkList">
+  <w:style w:type="table" w:styleId="aff5">
     <w:name w:val="Dark List"/>
-    <w:basedOn w:val="TableNormal"/>
+    <w:basedOn w:val="a3"/>
     <w:uiPriority w:val="70"/>
     <w:rsid w:val="00CB0664"/>
     <w:pPr>
@@ -10355,9 +10355,9 @@
       </w:tcPr>
     </w:tblStylePr>
   </w:style>
-  <w:style w:type="table" w:styleId="DarkList-Accent1">
+  <w:style w:type="table" w:styleId="-12">
     <w:name w:val="Dark List Accent 1"/>
-    <w:basedOn w:val="TableNormal"/>
+    <w:basedOn w:val="a3"/>
     <w:uiPriority w:val="70"/>
     <w:rsid w:val="00CB0664"/>
     <w:pPr>
@@ -10462,9 +10462,9 @@
       </w:tcPr>
     </w:tblStylePr>
   </w:style>
-  <w:style w:type="table" w:styleId="DarkList-Accent2">
+  <w:style w:type="table" w:styleId="-22">
     <w:name w:val="Dark List Accent 2"/>
-    <w:basedOn w:val="TableNormal"/>
+    <w:basedOn w:val="a3"/>
     <w:uiPriority w:val="70"/>
     <w:rsid w:val="00CB0664"/>
     <w:pPr>
@@ -10569,9 +10569,9 @@
       </w:tcPr>
     </w:tblStylePr>
   </w:style>
-  <w:style w:type="table" w:styleId="DarkList-Accent3">
+  <w:style w:type="table" w:styleId="-32">
     <w:name w:val="Dark List Accent 3"/>
-    <w:basedOn w:val="TableNormal"/>
+    <w:basedOn w:val="a3"/>
     <w:uiPriority w:val="70"/>
     <w:rsid w:val="00CB0664"/>
     <w:pPr>
@@ -10676,9 +10676,9 @@
       </w:tcPr>
     </w:tblStylePr>
   </w:style>
-  <w:style w:type="table" w:styleId="DarkList-Accent4">
+  <w:style w:type="table" w:styleId="-42">
     <w:name w:val="Dark List Accent 4"/>
-    <w:basedOn w:val="TableNormal"/>
+    <w:basedOn w:val="a3"/>
     <w:uiPriority w:val="70"/>
     <w:rsid w:val="00CB0664"/>
     <w:pPr>
@@ -10783,9 +10783,9 @@
       </w:tcPr>
     </w:tblStylePr>
   </w:style>
-  <w:style w:type="table" w:styleId="DarkList-Accent5">
+  <w:style w:type="table" w:styleId="-52">
     <w:name w:val="Dark List Accent 5"/>
-    <w:basedOn w:val="TableNormal"/>
+    <w:basedOn w:val="a3"/>
     <w:uiPriority w:val="70"/>
     <w:rsid w:val="00CB0664"/>
     <w:pPr>
@@ -10890,9 +10890,9 @@
       </w:tcPr>
     </w:tblStylePr>
   </w:style>
-  <w:style w:type="table" w:styleId="DarkList-Accent6">
+  <w:style w:type="table" w:styleId="-62">
     <w:name w:val="Dark List Accent 6"/>
-    <w:basedOn w:val="TableNormal"/>
+    <w:basedOn w:val="a3"/>
     <w:uiPriority w:val="70"/>
     <w:rsid w:val="00CB0664"/>
     <w:pPr>
@@ -10997,9 +10997,9 @@
       </w:tcPr>
     </w:tblStylePr>
   </w:style>
-  <w:style w:type="table" w:styleId="ColorfulShading">
+  <w:style w:type="table" w:styleId="aff6">
     <w:name w:val="Colorful Shading"/>
-    <w:basedOn w:val="TableNormal"/>
+    <w:basedOn w:val="a3"/>
     <w:uiPriority w:val="71"/>
     <w:rsid w:val="00CB0664"/>
     <w:pPr>
@@ -11112,9 +11112,9 @@
       </w:rPr>
     </w:tblStylePr>
   </w:style>
-  <w:style w:type="table" w:styleId="ColorfulShading-Accent1">
+  <w:style w:type="table" w:styleId="-13">
     <w:name w:val="Colorful Shading Accent 1"/>
-    <w:basedOn w:val="TableNormal"/>
+    <w:basedOn w:val="a3"/>
     <w:uiPriority w:val="71"/>
     <w:rsid w:val="00CB0664"/>
     <w:pPr>
@@ -11227,9 +11227,9 @@
       </w:rPr>
     </w:tblStylePr>
   </w:style>
-  <w:style w:type="table" w:styleId="ColorfulShading-Accent2">
+  <w:style w:type="table" w:styleId="-23">
     <w:name w:val="Colorful Shading Accent 2"/>
-    <w:basedOn w:val="TableNormal"/>
+    <w:basedOn w:val="a3"/>
     <w:uiPriority w:val="71"/>
     <w:rsid w:val="00CB0664"/>
     <w:pPr>
@@ -11342,9 +11342,9 @@
       </w:rPr>
     </w:tblStylePr>
   </w:style>
-  <w:style w:type="table" w:styleId="ColorfulShading-Accent3">
+  <w:style w:type="table" w:styleId="-33">
     <w:name w:val="Colorful Shading Accent 3"/>
-    <w:basedOn w:val="TableNormal"/>
+    <w:basedOn w:val="a3"/>
     <w:uiPriority w:val="71"/>
     <w:rsid w:val="00CB0664"/>
     <w:pPr>
@@ -11447,9 +11447,9 @@
       </w:tcPr>
     </w:tblStylePr>
   </w:style>
-  <w:style w:type="table" w:styleId="ColorfulShading-Accent4">
+  <w:style w:type="table" w:styleId="-43">
     <w:name w:val="Colorful Shading Accent 4"/>
-    <w:basedOn w:val="TableNormal"/>
+    <w:basedOn w:val="a3"/>
     <w:uiPriority w:val="71"/>
     <w:rsid w:val="00CB0664"/>
     <w:pPr>
@@ -11562,9 +11562,9 @@
       </w:rPr>
     </w:tblStylePr>
   </w:style>
-  <w:style w:type="table" w:styleId="ColorfulShading-Accent5">
+  <w:style w:type="table" w:styleId="-53">
     <w:name w:val="Colorful Shading Accent 5"/>
-    <w:basedOn w:val="TableNormal"/>
+    <w:basedOn w:val="a3"/>
     <w:uiPriority w:val="71"/>
     <w:rsid w:val="00CB0664"/>
     <w:pPr>
@@ -11677,9 +11677,9 @@
       </w:rPr>
     </w:tblStylePr>
   </w:style>
-  <w:style w:type="table" w:styleId="ColorfulShading-Accent6">
+  <w:style w:type="table" w:styleId="-63">
     <w:name w:val="Colorful Shading Accent 6"/>
-    <w:basedOn w:val="TableNormal"/>
+    <w:basedOn w:val="a3"/>
     <w:uiPriority w:val="71"/>
     <w:rsid w:val="00CB0664"/>
     <w:pPr>
@@ -11792,9 +11792,9 @@
       </w:rPr>
     </w:tblStylePr>
   </w:style>
-  <w:style w:type="table" w:styleId="ColorfulList">
+  <w:style w:type="table" w:styleId="aff7">
     <w:name w:val="Colorful List"/>
-    <w:basedOn w:val="TableNormal"/>
+    <w:basedOn w:val="a3"/>
     <w:uiPriority w:val="72"/>
     <w:rsid w:val="00CB0664"/>
     <w:pPr>
@@ -11871,9 +11871,9 @@
       </w:tcPr>
     </w:tblStylePr>
   </w:style>
-  <w:style w:type="table" w:styleId="ColorfulList-Accent1">
+  <w:style w:type="table" w:styleId="-14">
     <w:name w:val="Colorful List Accent 1"/>
-    <w:basedOn w:val="TableNormal"/>
+    <w:basedOn w:val="a3"/>
     <w:uiPriority w:val="72"/>
     <w:rsid w:val="00CB0664"/>
     <w:pPr>
@@ -11950,9 +11950,9 @@
       </w:tcPr>
     </w:tblStylePr>
   </w:style>
-  <w:style w:type="table" w:styleId="ColorfulList-Accent2">
+  <w:style w:type="table" w:styleId="-24">
     <w:name w:val="Colorful List Accent 2"/>
-    <w:basedOn w:val="TableNormal"/>
+    <w:basedOn w:val="a3"/>
     <w:uiPriority w:val="72"/>
     <w:rsid w:val="00CB0664"/>
     <w:pPr>
@@ -12029,9 +12029,9 @@
       </w:tcPr>
     </w:tblStylePr>
   </w:style>
-  <w:style w:type="table" w:styleId="ColorfulList-Accent3">
+  <w:style w:type="table" w:styleId="-34">
     <w:name w:val="Colorful List Accent 3"/>
-    <w:basedOn w:val="TableNormal"/>
+    <w:basedOn w:val="a3"/>
     <w:uiPriority w:val="72"/>
     <w:rsid w:val="00CB0664"/>
     <w:pPr>
@@ -12108,9 +12108,9 @@
       </w:tcPr>
     </w:tblStylePr>
   </w:style>
-  <w:style w:type="table" w:styleId="ColorfulList-Accent4">
+  <w:style w:type="table" w:styleId="-44">
     <w:name w:val="Colorful List Accent 4"/>
-    <w:basedOn w:val="TableNormal"/>
+    <w:basedOn w:val="a3"/>
     <w:uiPriority w:val="72"/>
     <w:rsid w:val="00CB0664"/>
     <w:pPr>
@@ -12187,9 +12187,9 @@
       </w:tcPr>
     </w:tblStylePr>
   </w:style>
-  <w:style w:type="table" w:styleId="ColorfulList-Accent5">
+  <w:style w:type="table" w:styleId="-54">
     <w:name w:val="Colorful List Accent 5"/>
-    <w:basedOn w:val="TableNormal"/>
+    <w:basedOn w:val="a3"/>
     <w:uiPriority w:val="72"/>
     <w:rsid w:val="00CB0664"/>
     <w:pPr>
@@ -12266,9 +12266,9 @@
       </w:tcPr>
     </w:tblStylePr>
   </w:style>
-  <w:style w:type="table" w:styleId="ColorfulList-Accent6">
+  <w:style w:type="table" w:styleId="-64">
     <w:name w:val="Colorful List Accent 6"/>
-    <w:basedOn w:val="TableNormal"/>
+    <w:basedOn w:val="a3"/>
     <w:uiPriority w:val="72"/>
     <w:rsid w:val="00CB0664"/>
     <w:pPr>
@@ -12345,9 +12345,9 @@
       </w:tcPr>
     </w:tblStylePr>
   </w:style>
-  <w:style w:type="table" w:styleId="ColorfulGrid">
+  <w:style w:type="table" w:styleId="aff8">
     <w:name w:val="Colorful Grid"/>
-    <w:basedOn w:val="TableNormal"/>
+    <w:basedOn w:val="a3"/>
     <w:uiPriority w:val="73"/>
     <w:rsid w:val="00CB0664"/>
     <w:pPr>
@@ -12418,9 +12418,9 @@
       </w:tcPr>
     </w:tblStylePr>
   </w:style>
-  <w:style w:type="table" w:styleId="ColorfulGrid-Accent1">
+  <w:style w:type="table" w:styleId="-15">
     <w:name w:val="Colorful Grid Accent 1"/>
-    <w:basedOn w:val="TableNormal"/>
+    <w:basedOn w:val="a3"/>
     <w:uiPriority w:val="73"/>
     <w:rsid w:val="00CB0664"/>
     <w:pPr>
@@ -12491,9 +12491,9 @@
       </w:tcPr>
     </w:tblStylePr>
   </w:style>
-  <w:style w:type="table" w:styleId="ColorfulGrid-Accent2">
+  <w:style w:type="table" w:styleId="-25">
     <w:name w:val="Colorful Grid Accent 2"/>
-    <w:basedOn w:val="TableNormal"/>
+    <w:basedOn w:val="a3"/>
     <w:uiPriority w:val="73"/>
     <w:rsid w:val="00CB0664"/>
     <w:pPr>
@@ -12564,9 +12564,9 @@
       </w:tcPr>
     </w:tblStylePr>
   </w:style>
-  <w:style w:type="table" w:styleId="ColorfulGrid-Accent3">
+  <w:style w:type="table" w:styleId="-35">
     <w:name w:val="Colorful Grid Accent 3"/>
-    <w:basedOn w:val="TableNormal"/>
+    <w:basedOn w:val="a3"/>
     <w:uiPriority w:val="73"/>
     <w:rsid w:val="00CB0664"/>
     <w:pPr>
@@ -12637,9 +12637,9 @@
       </w:tcPr>
     </w:tblStylePr>
   </w:style>
-  <w:style w:type="table" w:styleId="ColorfulGrid-Accent4">
+  <w:style w:type="table" w:styleId="-45">
     <w:name w:val="Colorful Grid Accent 4"/>
-    <w:basedOn w:val="TableNormal"/>
+    <w:basedOn w:val="a3"/>
     <w:uiPriority w:val="73"/>
     <w:rsid w:val="00CB0664"/>
     <w:pPr>
@@ -12710,9 +12710,9 @@
       </w:tcPr>
     </w:tblStylePr>
   </w:style>
-  <w:style w:type="table" w:styleId="ColorfulGrid-Accent5">
+  <w:style w:type="table" w:styleId="-55">
     <w:name w:val="Colorful Grid Accent 5"/>
-    <w:basedOn w:val="TableNormal"/>
+    <w:basedOn w:val="a3"/>
     <w:uiPriority w:val="73"/>
     <w:rsid w:val="00CB0664"/>
     <w:pPr>
@@ -12783,9 +12783,9 @@
       </w:tcPr>
     </w:tblStylePr>
   </w:style>
-  <w:style w:type="table" w:styleId="ColorfulGrid-Accent6">
+  <w:style w:type="table" w:styleId="-65">
     <w:name w:val="Colorful Grid Accent 6"/>
-    <w:basedOn w:val="TableNormal"/>
+    <w:basedOn w:val="a3"/>
     <w:uiPriority w:val="73"/>
     <w:rsid w:val="00CB0664"/>
     <w:pPr>

</xml_diff>